<commit_message>
Add account checklist and duck obstacle bonus step
Add account-checkliste.md for Scratch teacher/student account setup,
and a second differentiation tier (patrolling duck) for advanced kids
in the instruction cards and course plan.

Co-Authored-By: Claude Sonnet 5 <noreply@anthropic.com>
</commit_message>
<xml_diff>
--- a/kurs/anleitung-karten.docx
+++ b/kurs/anleitung-karten.docx
@@ -3233,6 +3233,767 @@
                 <w:szCs w:val="22"/>
               </w:rPr>
               <w:t xml:space="preserve">fertiges Fisch-Skript mit allen drei falls-Blöcken</w:t>
+            </w:r>
+          </w:p>
+        </w:tc>
+      </w:tr>
+    </w:tbl>
+    <w:p>
+      <w:pPr>
+        <w:pageBreakBefore/>
+        <w:pBdr>
+          <w:bottom w:val="single" w:color="1B6FA8" w:sz="12"/>
+        </w:pBdr>
+        <w:spacing w:after="240"/>
+        <w:jc w:val="center"/>
+      </w:pPr>
+      <w:r>
+        <w:rPr>
+          <w:rFonts w:ascii="Comic Sans MS" w:cs="Comic Sans MS" w:eastAsia="Comic Sans MS" w:hAnsi="Comic Sans MS"/>
+          <w:b/>
+          <w:bCs/>
+          <w:color w:val="1B6FA8"/>
+          <w:sz w:val="48"/>
+          <w:szCs w:val="48"/>
+        </w:rPr>
+        <w:t xml:space="preserve">🐟 Schritt F: Profi-Bonus – die Ente patrouilliert!</w:t>
+      </w:r>
+    </w:p>
+    <w:p>
+      <w:pPr>
+        <w:spacing w:after="80" w:before="80"/>
+      </w:pPr>
+      <w:r>
+        <w:rPr>
+          <w:rFonts w:ascii="Comic Sans MS" w:cs="Comic Sans MS" w:eastAsia="Comic Sans MS" w:hAnsi="Comic Sans MS"/>
+          <w:b/>
+          <w:bCs/>
+          <w:i w:val="false"/>
+          <w:iCs w:val="false"/>
+          <w:color w:val="1A1A1A"/>
+          <w:sz w:val="26"/>
+          <w:szCs w:val="26"/>
+        </w:rPr>
+        <w:t xml:space="preserve">Nur für echte Profis, die auch mit der Angel schon fertig sind! Jetzt kommt ein zweites Hindernis dazu: eine Ente 🦆, die zwischen Ufer und Ufer hin- und herschwimmt.</w:t>
+      </w:r>
+    </w:p>
+    <w:p>
+      <w:pPr>
+        <w:spacing w:after="160" w:before="120"/>
+        <w:jc w:val="center"/>
+      </w:pPr>
+      <w:r>
+        <w:drawing>
+          <wp:inline distT="0" distB="0" distL="0" distR="0">
+            <wp:extent cx="1619250" cy="1085850"/>
+            <wp:effectExtent t="0" r="0" b="0" l="0"/>
+            <wp:docPr id="1" name="" descr="" title=""/>
+            <wp:cNvGraphicFramePr>
+              <a:graphicFrameLocks xmlns:a="http://schemas.openxmlformats.org/drawingml/2006/main" noChangeAspect="1"/>
+            </wp:cNvGraphicFramePr>
+            <a:graphic xmlns:a="http://schemas.openxmlformats.org/drawingml/2006/main">
+              <a:graphicData uri="http://schemas.openxmlformats.org/drawingml/2006/picture">
+                <pic:pic xmlns:pic="http://schemas.openxmlformats.org/drawingml/2006/picture">
+                  <pic:nvPicPr>
+                    <pic:cNvPr id="0" name="" descr=""/>
+                    <pic:cNvPicPr>
+                      <a:picLocks noChangeAspect="1" noChangeArrowheads="1"/>
+                    </pic:cNvPicPr>
+                  </pic:nvPicPr>
+                  <pic:blipFill>
+                    <a:blip r:embed="rId10" cstate="none"/>
+                    <a:srcRect/>
+                    <a:stretch>
+                      <a:fillRect/>
+                    </a:stretch>
+                  </pic:blipFill>
+                  <pic:spPr bwMode="auto">
+                    <a:xfrm>
+                      <a:off x="0" y="0"/>
+                      <a:ext cx="1619250" cy="1085850"/>
+                    </a:xfrm>
+                    <a:prstGeom prst="rect">
+                      <a:avLst/>
+                    </a:prstGeom>
+                  </pic:spPr>
+                </pic:pic>
+              </a:graphicData>
+            </a:graphic>
+          </wp:inline>
+        </w:drawing>
+      </w:r>
+    </w:p>
+    <w:p>
+      <w:pPr>
+        <w:spacing w:after="120" w:before="200"/>
+      </w:pPr>
+      <w:r>
+        <w:rPr>
+          <w:rFonts w:ascii="Comic Sans MS" w:cs="Comic Sans MS" w:eastAsia="Comic Sans MS" w:hAnsi="Comic Sans MS"/>
+          <w:b/>
+          <w:bCs/>
+          <w:color w:val="1A1A1A"/>
+          <w:sz w:val="30"/>
+          <w:szCs w:val="30"/>
+        </w:rPr>
+        <w:t xml:space="preserve">Teil 1 – die Ente bewegt sich von selbst:</w:t>
+      </w:r>
+    </w:p>
+    <w:p>
+      <w:pPr>
+        <w:spacing w:after="80" w:before="80"/>
+      </w:pPr>
+      <w:r>
+        <w:rPr>
+          <w:rFonts w:ascii="Comic Sans MS" w:cs="Comic Sans MS" w:eastAsia="Comic Sans MS" w:hAnsi="Comic Sans MS"/>
+          <w:b w:val="false"/>
+          <w:bCs w:val="false"/>
+          <w:i w:val="false"/>
+          <w:iCs w:val="false"/>
+          <w:color w:val="1A1A1A"/>
+          <w:sz w:val="26"/>
+          <w:szCs w:val="26"/>
+        </w:rPr>
+        <w:t xml:space="preserve">Klick die Ente-Figur an und bau nach genau demselben Muster wie bei der Angel in Schritt E:</w:t>
+      </w:r>
+    </w:p>
+    <w:p>
+      <w:pPr>
+        <w:spacing w:after="60" w:before="60"/>
+        <w:ind w:left="260"/>
+      </w:pPr>
+      <w:r>
+        <w:rPr>
+          <w:rFonts w:ascii="Comic Sans MS" w:cs="Comic Sans MS" w:eastAsia="Comic Sans MS" w:hAnsi="Comic Sans MS"/>
+          <w:b/>
+          <w:bCs/>
+          <w:color w:val="1B6FA8"/>
+          <w:sz w:val="26"/>
+          <w:szCs w:val="26"/>
+        </w:rPr>
+        <w:t xml:space="preserve">1. </w:t>
+      </w:r>
+      <w:r>
+        <w:rPr>
+          <w:rFonts w:ascii="Comic Sans MS" w:cs="Comic Sans MS" w:eastAsia="Comic Sans MS" w:hAnsi="Comic Sans MS"/>
+          <w:color w:val="1A1A1A"/>
+          <w:sz w:val="26"/>
+          <w:szCs w:val="26"/>
+        </w:rPr>
+        <w:t xml:space="preserve">Kategorie 🟡 Ereignisse: „wenn grüne Fahne 🟢 angeklickt wird“</w:t>
+      </w:r>
+    </w:p>
+    <w:p>
+      <w:pPr>
+        <w:spacing w:after="60" w:before="60"/>
+        <w:ind w:left="260"/>
+      </w:pPr>
+      <w:r>
+        <w:rPr>
+          <w:rFonts w:ascii="Comic Sans MS" w:cs="Comic Sans MS" w:eastAsia="Comic Sans MS" w:hAnsi="Comic Sans MS"/>
+          <w:b/>
+          <w:bCs/>
+          <w:color w:val="1B6FA8"/>
+          <w:sz w:val="26"/>
+          <w:szCs w:val="26"/>
+        </w:rPr>
+        <w:t xml:space="preserve">2. </w:t>
+      </w:r>
+      <w:r>
+        <w:rPr>
+          <w:rFonts w:ascii="Comic Sans MS" w:cs="Comic Sans MS" w:eastAsia="Comic Sans MS" w:hAnsi="Comic Sans MS"/>
+          <w:color w:val="1A1A1A"/>
+          <w:sz w:val="26"/>
+          <w:szCs w:val="26"/>
+        </w:rPr>
+        <w:t xml:space="preserve">Kategorie 🟠 Steuerung: „wiederhole fortlaufend“</w:t>
+      </w:r>
+    </w:p>
+    <w:p>
+      <w:pPr>
+        <w:spacing w:after="60" w:before="60"/>
+        <w:ind w:left="260"/>
+      </w:pPr>
+      <w:r>
+        <w:rPr>
+          <w:rFonts w:ascii="Comic Sans MS" w:cs="Comic Sans MS" w:eastAsia="Comic Sans MS" w:hAnsi="Comic Sans MS"/>
+          <w:b/>
+          <w:bCs/>
+          <w:color w:val="1B6FA8"/>
+          <w:sz w:val="26"/>
+          <w:szCs w:val="26"/>
+        </w:rPr>
+        <w:t xml:space="preserve">3. </w:t>
+      </w:r>
+      <w:r>
+        <w:rPr>
+          <w:rFonts w:ascii="Comic Sans MS" w:cs="Comic Sans MS" w:eastAsia="Comic Sans MS" w:hAnsi="Comic Sans MS"/>
+          <w:color w:val="1A1A1A"/>
+          <w:sz w:val="26"/>
+          <w:szCs w:val="26"/>
+        </w:rPr>
+        <w:t xml:space="preserve">Darin: Kategorie 🔵 Bewegung: „gehe ( ) Schritte“ und „pralle vom Rand ab“</w:t>
+      </w:r>
+    </w:p>
+    <w:tbl>
+      <w:tblPr>
+        <w:tblW w:type="dxa" w:w="10206"/>
+        <w:tblBorders>
+          <w:top w:val="single" w:color="E8B923" w:sz="8"/>
+          <w:left w:val="single" w:color="E8B923" w:sz="8"/>
+          <w:bottom w:val="single" w:color="E8B923" w:sz="8"/>
+          <w:right w:val="single" w:color="E8B923" w:sz="8"/>
+          <w:insideH w:val="none" w:color="FFFFFF" w:sz="0"/>
+          <w:insideV w:val="none" w:color="FFFFFF" w:sz="0"/>
+        </w:tblBorders>
+      </w:tblPr>
+      <w:tblGrid>
+        <w:gridCol w:w="10206"/>
+      </w:tblGrid>
+      <w:tr>
+        <w:tc>
+          <w:tcPr>
+            <w:tcW w:type="dxa" w:w="10206"/>
+            <w:shd w:fill="FFF6D9" w:val="clear"/>
+            <w:tcMar>
+              <w:top w:type="dxa" w:w="160"/>
+              <w:left w:type="dxa" w:w="220"/>
+              <w:bottom w:type="dxa" w:w="160"/>
+              <w:right w:type="dxa" w:w="220"/>
+            </w:tcMar>
+          </w:tcPr>
+          <w:p>
+            <w:r>
+              <w:rPr>
+                <w:rFonts w:ascii="Comic Sans MS" w:cs="Comic Sans MS" w:eastAsia="Comic Sans MS" w:hAnsi="Comic Sans MS"/>
+                <w:b/>
+                <w:bCs/>
+                <w:color w:val="7A5B00"/>
+                <w:sz w:val="26"/>
+                <w:szCs w:val="26"/>
+              </w:rPr>
+              <w:t xml:space="preserve">💡 Tipp: </w:t>
+            </w:r>
+            <w:r>
+              <w:rPr>
+                <w:rFonts w:ascii="Comic Sans MS" w:cs="Comic Sans MS" w:eastAsia="Comic Sans MS" w:hAnsi="Comic Sans MS"/>
+                <w:color w:val="1A1A1A"/>
+                <w:sz w:val="26"/>
+                <w:szCs w:val="26"/>
+              </w:rPr>
+              <w:t xml:space="preserve">Damit die Ente hoch und runter statt links-rechts patrouilliert (spannender, weil anders als die Angel!), ergänze vor der Dauerschleife noch: Kategorie 🔵 Bewegung → Block „setze Richtung auf ( ) Grad“ mit dem Wert 0.</w:t>
+            </w:r>
+          </w:p>
+        </w:tc>
+      </w:tr>
+    </w:tbl>
+    <w:p>
+      <w:pPr>
+        <w:spacing w:after="120" w:before="200"/>
+      </w:pPr>
+      <w:r>
+        <w:rPr>
+          <w:rFonts w:ascii="Comic Sans MS" w:cs="Comic Sans MS" w:eastAsia="Comic Sans MS" w:hAnsi="Comic Sans MS"/>
+          <w:b/>
+          <w:bCs/>
+          <w:color w:val="1A1A1A"/>
+          <w:sz w:val="30"/>
+          <w:szCs w:val="30"/>
+        </w:rPr>
+        <w:t xml:space="preserve">Teil 2 – wenn der Fisch die Ente berührt, geht's zurück zum Start:</w:t>
+      </w:r>
+    </w:p>
+    <w:p>
+      <w:pPr>
+        <w:spacing w:after="80" w:before="80"/>
+      </w:pPr>
+      <w:r>
+        <w:rPr>
+          <w:rFonts w:ascii="Comic Sans MS" w:cs="Comic Sans MS" w:eastAsia="Comic Sans MS" w:hAnsi="Comic Sans MS"/>
+          <w:b w:val="false"/>
+          <w:bCs w:val="false"/>
+          <w:i w:val="false"/>
+          <w:iCs w:val="false"/>
+          <w:color w:val="1A1A1A"/>
+          <w:sz w:val="26"/>
+          <w:szCs w:val="26"/>
+        </w:rPr>
+        <w:t xml:space="preserve">Klick wieder deine Fisch-Figur an. Baue einen vierten falls...dann-Block in deine bestehende Dauerschleife — genau nach demselben Muster wie bei Ufer und Angel, nur diesmal mit „wird Ente berührt?“.</w:t>
+      </w:r>
+    </w:p>
+    <w:p>
+      <w:pPr>
+        <w:spacing w:after="160"/>
+      </w:pPr>
+    </w:p>
+    <w:tbl>
+      <w:tblPr>
+        <w:tblW w:type="dxa" w:w="10206"/>
+        <w:tblBorders>
+          <w:top w:val="dashed" w:color="AAAAAA" w:sz="8"/>
+          <w:left w:val="dashed" w:color="AAAAAA" w:sz="8"/>
+          <w:bottom w:val="dashed" w:color="AAAAAA" w:sz="8"/>
+          <w:right w:val="dashed" w:color="AAAAAA" w:sz="8"/>
+          <w:insideH w:val="none" w:color="FFFFFF" w:sz="0"/>
+          <w:insideV w:val="none" w:color="FFFFFF" w:sz="0"/>
+        </w:tblBorders>
+      </w:tblPr>
+      <w:tblGrid>
+        <w:gridCol w:w="10206"/>
+      </w:tblGrid>
+      <w:tr>
+        <w:tc>
+          <w:tcPr>
+            <w:tcW w:type="dxa" w:w="10206"/>
+            <w:shd w:fill="F4F4F4" w:val="clear"/>
+            <w:tcMar>
+              <w:top w:type="dxa" w:w="160"/>
+              <w:left w:type="dxa" w:w="220"/>
+              <w:bottom w:type="dxa" w:w="160"/>
+              <w:right w:type="dxa" w:w="220"/>
+            </w:tcMar>
+          </w:tcPr>
+          <w:p>
+            <w:pPr>
+              <w:spacing w:after="320" w:before="320"/>
+              <w:jc w:val="center"/>
+            </w:pPr>
+            <w:r>
+              <w:rPr>
+                <w:rFonts w:ascii="Comic Sans MS" w:cs="Comic Sans MS" w:eastAsia="Comic Sans MS" w:hAnsi="Comic Sans MS"/>
+                <w:b/>
+                <w:bCs/>
+                <w:color w:val="666666"/>
+                <w:sz w:val="26"/>
+                <w:szCs w:val="26"/>
+              </w:rPr>
+              <w:t xml:space="preserve">🖼️  Platz für Screenshot</w:t>
+            </w:r>
+          </w:p>
+          <w:p>
+            <w:pPr>
+              <w:spacing w:after="320"/>
+              <w:jc w:val="center"/>
+            </w:pPr>
+            <w:r>
+              <w:rPr>
+                <w:rFonts w:ascii="Comic Sans MS" w:cs="Comic Sans MS" w:eastAsia="Comic Sans MS" w:hAnsi="Comic Sans MS"/>
+                <w:i/>
+                <w:iCs/>
+                <w:color w:val="888888"/>
+                <w:sz w:val="22"/>
+                <w:szCs w:val="22"/>
+              </w:rPr>
+              <w:t xml:space="preserve">Ente-Figur mit eigenem Bewegungsskript</w:t>
+            </w:r>
+          </w:p>
+        </w:tc>
+      </w:tr>
+    </w:tbl>
+    <w:p>
+      <w:pPr>
+        <w:pageBreakBefore/>
+        <w:pBdr>
+          <w:bottom w:val="single" w:color="1B6FA8" w:sz="12"/>
+        </w:pBdr>
+        <w:spacing w:after="240"/>
+        <w:jc w:val="center"/>
+      </w:pPr>
+      <w:r>
+        <w:rPr>
+          <w:rFonts w:ascii="Comic Sans MS" w:cs="Comic Sans MS" w:eastAsia="Comic Sans MS" w:hAnsi="Comic Sans MS"/>
+          <w:b/>
+          <w:bCs/>
+          <w:color w:val="1B6FA8"/>
+          <w:sz w:val="48"/>
+          <w:szCs w:val="48"/>
+        </w:rPr>
+        <w:t xml:space="preserve">🔑 Lösung – Schritt F</w:t>
+      </w:r>
+    </w:p>
+    <w:p>
+      <w:pPr>
+        <w:spacing w:after="80" w:before="80"/>
+      </w:pPr>
+      <w:r>
+        <w:rPr>
+          <w:rFonts w:ascii="Comic Sans MS" w:cs="Comic Sans MS" w:eastAsia="Comic Sans MS" w:hAnsi="Comic Sans MS"/>
+          <w:b/>
+          <w:bCs/>
+          <w:i w:val="false"/>
+          <w:iCs w:val="false"/>
+          <w:color w:val="1A1A1A"/>
+          <w:sz w:val="26"/>
+          <w:szCs w:val="26"/>
+        </w:rPr>
+        <w:t xml:space="preserve">Skript auf der Ente-Figur:</w:t>
+      </w:r>
+    </w:p>
+    <w:tbl>
+      <w:tblPr>
+        <w:tblW w:type="dxa" w:w="10206"/>
+        <w:tblBorders>
+          <w:top w:val="single" w:color="333333" w:sz="8"/>
+          <w:left w:val="single" w:color="333333" w:sz="8"/>
+          <w:bottom w:val="single" w:color="333333" w:sz="8"/>
+          <w:right w:val="single" w:color="333333" w:sz="8"/>
+          <w:insideH w:val="single" w:color="FFFFFF" w:sz="2"/>
+          <w:insideV w:val="none" w:color="FFFFFF" w:sz="0"/>
+        </w:tblBorders>
+      </w:tblPr>
+      <w:tblGrid>
+        <w:gridCol w:w="10206"/>
+      </w:tblGrid>
+      <w:tr>
+        <w:tc>
+          <w:tcPr>
+            <w:tcW w:type="dxa" w:w="10206"/>
+            <w:shd w:fill="FFBF00" w:val="clear"/>
+            <w:tcMar>
+              <w:top w:type="dxa" w:w="110"/>
+              <w:left w:type="dxa" w:w="260"/>
+              <w:bottom w:type="dxa" w:w="110"/>
+              <w:right w:type="dxa" w:w="200"/>
+            </w:tcMar>
+          </w:tcPr>
+          <w:p>
+            <w:r>
+              <w:rPr>
+                <w:rFonts w:ascii="Comic Sans MS" w:cs="Comic Sans MS" w:eastAsia="Comic Sans MS" w:hAnsi="Comic Sans MS"/>
+                <w:b/>
+                <w:bCs/>
+                <w:color w:val="1A1A1A"/>
+                <w:sz w:val="24"/>
+                <w:szCs w:val="24"/>
+              </w:rPr>
+              <w:t xml:space="preserve">wenn grüne Fahne 🟢 angeklickt wird</w:t>
+            </w:r>
+          </w:p>
+        </w:tc>
+      </w:tr>
+      <w:tr>
+        <w:tc>
+          <w:tcPr>
+            <w:tcW w:type="dxa" w:w="10206"/>
+            <w:shd w:fill="4C97FF" w:val="clear"/>
+            <w:tcMar>
+              <w:top w:type="dxa" w:w="110"/>
+              <w:left w:type="dxa" w:w="260"/>
+              <w:bottom w:type="dxa" w:w="110"/>
+              <w:right w:type="dxa" w:w="200"/>
+            </w:tcMar>
+          </w:tcPr>
+          <w:p>
+            <w:r>
+              <w:rPr>
+                <w:rFonts w:ascii="Comic Sans MS" w:cs="Comic Sans MS" w:eastAsia="Comic Sans MS" w:hAnsi="Comic Sans MS"/>
+                <w:b/>
+                <w:bCs/>
+                <w:color w:val="1A1A1A"/>
+                <w:sz w:val="24"/>
+                <w:szCs w:val="24"/>
+              </w:rPr>
+              <w:t xml:space="preserve">setze Richtung auf (0) Grad</w:t>
+            </w:r>
+          </w:p>
+        </w:tc>
+      </w:tr>
+      <w:tr>
+        <w:tc>
+          <w:tcPr>
+            <w:tcW w:type="dxa" w:w="10206"/>
+            <w:shd w:fill="FFAB19" w:val="clear"/>
+            <w:tcMar>
+              <w:top w:type="dxa" w:w="110"/>
+              <w:left w:type="dxa" w:w="260"/>
+              <w:bottom w:type="dxa" w:w="110"/>
+              <w:right w:type="dxa" w:w="200"/>
+            </w:tcMar>
+          </w:tcPr>
+          <w:p>
+            <w:r>
+              <w:rPr>
+                <w:rFonts w:ascii="Comic Sans MS" w:cs="Comic Sans MS" w:eastAsia="Comic Sans MS" w:hAnsi="Comic Sans MS"/>
+                <w:b/>
+                <w:bCs/>
+                <w:color w:val="1A1A1A"/>
+                <w:sz w:val="24"/>
+                <w:szCs w:val="24"/>
+              </w:rPr>
+              <w:t xml:space="preserve">wiederhole fortlaufend</w:t>
+            </w:r>
+          </w:p>
+        </w:tc>
+      </w:tr>
+      <w:tr>
+        <w:tc>
+          <w:tcPr>
+            <w:tcW w:type="dxa" w:w="10206"/>
+            <w:shd w:fill="4C97FF" w:val="clear"/>
+            <w:tcMar>
+              <w:top w:type="dxa" w:w="110"/>
+              <w:left w:type="dxa" w:w="780"/>
+              <w:bottom w:type="dxa" w:w="110"/>
+              <w:right w:type="dxa" w:w="200"/>
+            </w:tcMar>
+          </w:tcPr>
+          <w:p>
+            <w:r>
+              <w:rPr>
+                <w:rFonts w:ascii="Comic Sans MS" w:cs="Comic Sans MS" w:eastAsia="Comic Sans MS" w:hAnsi="Comic Sans MS"/>
+                <w:b/>
+                <w:bCs/>
+                <w:color w:val="1A1A1A"/>
+                <w:sz w:val="24"/>
+                <w:szCs w:val="24"/>
+              </w:rPr>
+              <w:t xml:space="preserve">gehe (4) Schritte</w:t>
+            </w:r>
+          </w:p>
+        </w:tc>
+      </w:tr>
+      <w:tr>
+        <w:tc>
+          <w:tcPr>
+            <w:tcW w:type="dxa" w:w="10206"/>
+            <w:shd w:fill="4C97FF" w:val="clear"/>
+            <w:tcMar>
+              <w:top w:type="dxa" w:w="110"/>
+              <w:left w:type="dxa" w:w="780"/>
+              <w:bottom w:type="dxa" w:w="110"/>
+              <w:right w:type="dxa" w:w="200"/>
+            </w:tcMar>
+          </w:tcPr>
+          <w:p>
+            <w:r>
+              <w:rPr>
+                <w:rFonts w:ascii="Comic Sans MS" w:cs="Comic Sans MS" w:eastAsia="Comic Sans MS" w:hAnsi="Comic Sans MS"/>
+                <w:b/>
+                <w:bCs/>
+                <w:color w:val="1A1A1A"/>
+                <w:sz w:val="24"/>
+                <w:szCs w:val="24"/>
+              </w:rPr>
+              <w:t xml:space="preserve">pralle vom Rand ab</w:t>
+            </w:r>
+          </w:p>
+        </w:tc>
+      </w:tr>
+    </w:tbl>
+    <w:p>
+      <w:pPr>
+        <w:spacing w:after="160"/>
+      </w:pPr>
+    </w:p>
+    <w:p>
+      <w:pPr>
+        <w:spacing w:after="80" w:before="80"/>
+      </w:pPr>
+      <w:r>
+        <w:rPr>
+          <w:rFonts w:ascii="Comic Sans MS" w:cs="Comic Sans MS" w:eastAsia="Comic Sans MS" w:hAnsi="Comic Sans MS"/>
+          <w:b/>
+          <w:bCs/>
+          <w:i w:val="false"/>
+          <w:iCs w:val="false"/>
+          <w:color w:val="1A1A1A"/>
+          <w:sz w:val="26"/>
+          <w:szCs w:val="26"/>
+        </w:rPr>
+        <w:t xml:space="preserve">Ergänzung auf der Fisch-Figur, vierter falls...dann in der bekannten Dauerschleife:</w:t>
+      </w:r>
+    </w:p>
+    <w:tbl>
+      <w:tblPr>
+        <w:tblW w:type="dxa" w:w="10206"/>
+        <w:tblBorders>
+          <w:top w:val="single" w:color="333333" w:sz="8"/>
+          <w:left w:val="single" w:color="333333" w:sz="8"/>
+          <w:bottom w:val="single" w:color="333333" w:sz="8"/>
+          <w:right w:val="single" w:color="333333" w:sz="8"/>
+          <w:insideH w:val="single" w:color="FFFFFF" w:sz="2"/>
+          <w:insideV w:val="none" w:color="FFFFFF" w:sz="0"/>
+        </w:tblBorders>
+      </w:tblPr>
+      <w:tblGrid>
+        <w:gridCol w:w="10206"/>
+      </w:tblGrid>
+      <w:tr>
+        <w:tc>
+          <w:tcPr>
+            <w:tcW w:type="dxa" w:w="10206"/>
+            <w:shd w:fill="FFAB19" w:val="clear"/>
+            <w:tcMar>
+              <w:top w:type="dxa" w:w="110"/>
+              <w:left w:type="dxa" w:w="780"/>
+              <w:bottom w:type="dxa" w:w="110"/>
+              <w:right w:type="dxa" w:w="200"/>
+            </w:tcMar>
+          </w:tcPr>
+          <w:p>
+            <w:r>
+              <w:rPr>
+                <w:rFonts w:ascii="Comic Sans MS" w:cs="Comic Sans MS" w:eastAsia="Comic Sans MS" w:hAnsi="Comic Sans MS"/>
+                <w:b/>
+                <w:bCs/>
+                <w:color w:val="1A1A1A"/>
+                <w:sz w:val="24"/>
+                <w:szCs w:val="24"/>
+              </w:rPr>
+              <w:t xml:space="preserve">falls &lt; 🔷 wird [Ente] berührt? &gt;, dann</w:t>
+            </w:r>
+          </w:p>
+        </w:tc>
+      </w:tr>
+      <w:tr>
+        <w:tc>
+          <w:tcPr>
+            <w:tcW w:type="dxa" w:w="10206"/>
+            <w:shd w:fill="4C97FF" w:val="clear"/>
+            <w:tcMar>
+              <w:top w:type="dxa" w:w="110"/>
+              <w:left w:type="dxa" w:w="1300"/>
+              <w:bottom w:type="dxa" w:w="110"/>
+              <w:right w:type="dxa" w:w="200"/>
+            </w:tcMar>
+          </w:tcPr>
+          <w:p>
+            <w:r>
+              <w:rPr>
+                <w:rFonts w:ascii="Comic Sans MS" w:cs="Comic Sans MS" w:eastAsia="Comic Sans MS" w:hAnsi="Comic Sans MS"/>
+                <w:b/>
+                <w:bCs/>
+                <w:color w:val="1A1A1A"/>
+                <w:sz w:val="24"/>
+                <w:szCs w:val="24"/>
+              </w:rPr>
+              <w:t xml:space="preserve">gehe zu x: (⚙️ Start-x) y: (⚙️ Start-y)</w:t>
+            </w:r>
+          </w:p>
+        </w:tc>
+      </w:tr>
+    </w:tbl>
+    <w:p>
+      <w:pPr>
+        <w:spacing w:after="160"/>
+      </w:pPr>
+    </w:p>
+    <w:tbl>
+      <w:tblPr>
+        <w:tblW w:type="dxa" w:w="10206"/>
+        <w:tblBorders>
+          <w:top w:val="single" w:color="E8B923" w:sz="8"/>
+          <w:left w:val="single" w:color="E8B923" w:sz="8"/>
+          <w:bottom w:val="single" w:color="E8B923" w:sz="8"/>
+          <w:right w:val="single" w:color="E8B923" w:sz="8"/>
+          <w:insideH w:val="none" w:color="FFFFFF" w:sz="0"/>
+          <w:insideV w:val="none" w:color="FFFFFF" w:sz="0"/>
+        </w:tblBorders>
+      </w:tblPr>
+      <w:tblGrid>
+        <w:gridCol w:w="10206"/>
+      </w:tblGrid>
+      <w:tr>
+        <w:tc>
+          <w:tcPr>
+            <w:tcW w:type="dxa" w:w="10206"/>
+            <w:shd w:fill="FFF6D9" w:val="clear"/>
+            <w:tcMar>
+              <w:top w:type="dxa" w:w="160"/>
+              <w:left w:type="dxa" w:w="220"/>
+              <w:bottom w:type="dxa" w:w="160"/>
+              <w:right w:type="dxa" w:w="220"/>
+            </w:tcMar>
+          </w:tcPr>
+          <w:p>
+            <w:r>
+              <w:rPr>
+                <w:rFonts w:ascii="Comic Sans MS" w:cs="Comic Sans MS" w:eastAsia="Comic Sans MS" w:hAnsi="Comic Sans MS"/>
+                <w:b/>
+                <w:bCs/>
+                <w:color w:val="7A5B00"/>
+                <w:sz w:val="26"/>
+                <w:szCs w:val="26"/>
+              </w:rPr>
+              <w:t xml:space="preserve">💡 Tipp: </w:t>
+            </w:r>
+            <w:r>
+              <w:rPr>
+                <w:rFonts w:ascii="Comic Sans MS" w:cs="Comic Sans MS" w:eastAsia="Comic Sans MS" w:hAnsi="Comic Sans MS"/>
+                <w:color w:val="1A1A1A"/>
+                <w:sz w:val="26"/>
+                <w:szCs w:val="26"/>
+              </w:rPr>
+              <w:t xml:space="preserve">Jetzt hat dein Fisch zwei Gegner gleichzeitig im Weg — Angel und Ente. Wenn das zu leicht ist: Erhöh einfach die Zahl bei „gehe ( ) Schritte“ bei beiden, damit sie schneller patrouillieren!</w:t>
+            </w:r>
+          </w:p>
+        </w:tc>
+      </w:tr>
+    </w:tbl>
+    <w:p>
+      <w:pPr>
+        <w:spacing w:after="160"/>
+      </w:pPr>
+    </w:p>
+    <w:tbl>
+      <w:tblPr>
+        <w:tblW w:type="dxa" w:w="10206"/>
+        <w:tblBorders>
+          <w:top w:val="dashed" w:color="AAAAAA" w:sz="8"/>
+          <w:left w:val="dashed" w:color="AAAAAA" w:sz="8"/>
+          <w:bottom w:val="dashed" w:color="AAAAAA" w:sz="8"/>
+          <w:right w:val="dashed" w:color="AAAAAA" w:sz="8"/>
+          <w:insideH w:val="none" w:color="FFFFFF" w:sz="0"/>
+          <w:insideV w:val="none" w:color="FFFFFF" w:sz="0"/>
+        </w:tblBorders>
+      </w:tblPr>
+      <w:tblGrid>
+        <w:gridCol w:w="10206"/>
+      </w:tblGrid>
+      <w:tr>
+        <w:tc>
+          <w:tcPr>
+            <w:tcW w:type="dxa" w:w="10206"/>
+            <w:shd w:fill="F4F4F4" w:val="clear"/>
+            <w:tcMar>
+              <w:top w:type="dxa" w:w="160"/>
+              <w:left w:type="dxa" w:w="220"/>
+              <w:bottom w:type="dxa" w:w="160"/>
+              <w:right w:type="dxa" w:w="220"/>
+            </w:tcMar>
+          </w:tcPr>
+          <w:p>
+            <w:pPr>
+              <w:spacing w:after="320" w:before="320"/>
+              <w:jc w:val="center"/>
+            </w:pPr>
+            <w:r>
+              <w:rPr>
+                <w:rFonts w:ascii="Comic Sans MS" w:cs="Comic Sans MS" w:eastAsia="Comic Sans MS" w:hAnsi="Comic Sans MS"/>
+                <w:b/>
+                <w:bCs/>
+                <w:color w:val="666666"/>
+                <w:sz w:val="26"/>
+                <w:szCs w:val="26"/>
+              </w:rPr>
+              <w:t xml:space="preserve">🖼️  Platz für Screenshot</w:t>
+            </w:r>
+          </w:p>
+          <w:p>
+            <w:pPr>
+              <w:spacing w:after="320"/>
+              <w:jc w:val="center"/>
+            </w:pPr>
+            <w:r>
+              <w:rPr>
+                <w:rFonts w:ascii="Comic Sans MS" w:cs="Comic Sans MS" w:eastAsia="Comic Sans MS" w:hAnsi="Comic Sans MS"/>
+                <w:i/>
+                <w:iCs/>
+                <w:color w:val="888888"/>
+                <w:sz w:val="22"/>
+                <w:szCs w:val="22"/>
+              </w:rPr>
+              <w:t xml:space="preserve">fertiges Fisch-Skript mit allen vier falls-Blöcken</w:t>
             </w:r>
           </w:p>
         </w:tc>

</xml_diff>

<commit_message>
Rewrite course docs for natural, human-sounding German
Apply Wolf Schneider style rules and an AI-writing-tell checklist
across the course documents: active voice over passive, fewer
adjective triplets, and shorter sentences in ablaufplan.md and
account-checkliste.md. In anleitung-karten.md/.docx, replace
verb-less fragment instructions with real imperative sentences,
de-duplicate near-identical wording between the Angel and Ente bonus
cards, and cut random mid-sentence bolding and decorative emoji.

Co-Authored-By: Claude Sonnet 5 <noreply@anthropic.com>
</commit_message>
<xml_diff>
--- a/kurs/anleitung-karten.docx
+++ b/kurs/anleitung-karten.docx
@@ -386,7 +386,7 @@
           <w:sz w:val="26"/>
           <w:szCs w:val="26"/>
         </w:rPr>
-        <w:t xml:space="preserve">Bei diesem Schritt gibt es noch nichts zu bauen — du hast nur dein Projekt geöffnet und dir alles angeschaut. ✅</w:t>
+        <w:t xml:space="preserve">Bei diesem Schritt gibt es noch nichts zu bauen. Du hast nur dein Projekt geöffnet und dir alles angeschaut.</w:t>
       </w:r>
     </w:p>
     <w:p>
@@ -404,85 +404,7 @@
           <w:sz w:val="26"/>
           <w:szCs w:val="26"/>
         </w:rPr>
-        <w:t xml:space="preserve">Wenn du das hier siehst, ist alles bereit für Schritt B:</w:t>
-      </w:r>
-    </w:p>
-    <w:p>
-      <w:pPr>
-        <w:spacing w:after="60" w:before="60"/>
-        <w:ind w:left="260"/>
-      </w:pPr>
-      <w:r>
-        <w:rPr>
-          <w:rFonts w:ascii="Comic Sans MS" w:cs="Comic Sans MS" w:eastAsia="Comic Sans MS" w:hAnsi="Comic Sans MS"/>
-          <w:b/>
-          <w:bCs/>
-          <w:color w:val="1B6FA8"/>
-          <w:sz w:val="26"/>
-          <w:szCs w:val="26"/>
-        </w:rPr>
-        <w:t xml:space="preserve">1. </w:t>
-      </w:r>
-      <w:r>
-        <w:rPr>
-          <w:rFonts w:ascii="Comic Sans MS" w:cs="Comic Sans MS" w:eastAsia="Comic Sans MS" w:hAnsi="Comic Sans MS"/>
-          <w:color w:val="1A1A1A"/>
-          <w:sz w:val="26"/>
-          <w:szCs w:val="26"/>
-        </w:rPr>
-        <w:t xml:space="preserve">deinen Fisch 🐟 auf dem Wasser</w:t>
-      </w:r>
-    </w:p>
-    <w:p>
-      <w:pPr>
-        <w:spacing w:after="60" w:before="60"/>
-        <w:ind w:left="260"/>
-      </w:pPr>
-      <w:r>
-        <w:rPr>
-          <w:rFonts w:ascii="Comic Sans MS" w:cs="Comic Sans MS" w:eastAsia="Comic Sans MS" w:hAnsi="Comic Sans MS"/>
-          <w:b/>
-          <w:bCs/>
-          <w:color w:val="1B6FA8"/>
-          <w:sz w:val="26"/>
-          <w:szCs w:val="26"/>
-        </w:rPr>
-        <w:t xml:space="preserve">2. </w:t>
-      </w:r>
-      <w:r>
-        <w:rPr>
-          <w:rFonts w:ascii="Comic Sans MS" w:cs="Comic Sans MS" w:eastAsia="Comic Sans MS" w:hAnsi="Comic Sans MS"/>
-          <w:color w:val="1A1A1A"/>
-          <w:sz w:val="26"/>
-          <w:szCs w:val="26"/>
-        </w:rPr>
-        <w:t xml:space="preserve">das Ufer am Rand</w:t>
-      </w:r>
-    </w:p>
-    <w:p>
-      <w:pPr>
-        <w:spacing w:after="60" w:before="60"/>
-        <w:ind w:left="260"/>
-      </w:pPr>
-      <w:r>
-        <w:rPr>
-          <w:rFonts w:ascii="Comic Sans MS" w:cs="Comic Sans MS" w:eastAsia="Comic Sans MS" w:hAnsi="Comic Sans MS"/>
-          <w:b/>
-          <w:bCs/>
-          <w:color w:val="1B6FA8"/>
-          <w:sz w:val="26"/>
-          <w:szCs w:val="26"/>
-        </w:rPr>
-        <w:t xml:space="preserve">3. </w:t>
-      </w:r>
-      <w:r>
-        <w:rPr>
-          <w:rFonts w:ascii="Comic Sans MS" w:cs="Comic Sans MS" w:eastAsia="Comic Sans MS" w:hAnsi="Comic Sans MS"/>
-          <w:color w:val="1A1A1A"/>
-          <w:sz w:val="26"/>
-          <w:szCs w:val="26"/>
-        </w:rPr>
-        <w:t xml:space="preserve">den Abenteuerspielplatz irgendwo auf der Karte</w:t>
+        <w:t xml:space="preserve">Siehst du deinen Fisch auf dem Wasser, das Ufer am Rand und den Abenteuerspielplatz irgendwo auf der Karte? Dann ist alles bereit für Schritt B!</w:t>
       </w:r>
     </w:p>
     <w:p>
@@ -914,8 +836,8 @@
       <w:r>
         <w:rPr>
           <w:rFonts w:ascii="Comic Sans MS" w:cs="Comic Sans MS" w:eastAsia="Comic Sans MS" w:hAnsi="Comic Sans MS"/>
-          <w:b/>
-          <w:bCs/>
+          <w:b w:val="false"/>
+          <w:bCs w:val="false"/>
           <w:i w:val="false"/>
           <w:iCs w:val="false"/>
           <w:color w:val="1A1A1A"/>
@@ -1390,7 +1312,7 @@
           <w:sz w:val="26"/>
           <w:szCs w:val="26"/>
         </w:rPr>
-        <w:t xml:space="preserve">Kategorie 🟡 Ereignisse: Block „wenn grüne Fahne 🟢 angeklickt wird“ auf eine neue, freie Stelle ziehen.</w:t>
+        <w:t xml:space="preserve">Zieh den Block „wenn grüne Fahne 🟢 angeklickt wird“ (🟡 Ereignisse) auf eine neue, freie Stelle der Bühne.</w:t>
       </w:r>
     </w:p>
     <w:p>
@@ -1416,7 +1338,7 @@
           <w:sz w:val="26"/>
           <w:szCs w:val="26"/>
         </w:rPr>
-        <w:t xml:space="preserve">Kategorie 🔵 Bewegung: Block „gehe zu x: ( ) y: ( )“ direkt darunter — das setzt deinen Fisch beim Start an seinen Platz.</w:t>
+        <w:t xml:space="preserve">Häng den Block „gehe zu x: ( ) y: ( )“ (🔵 Bewegung) direkt darunter — er setzt deinen Fisch beim Start an seinen Platz.</w:t>
       </w:r>
     </w:p>
     <w:p>
@@ -1442,7 +1364,7 @@
           <w:sz w:val="26"/>
           <w:szCs w:val="26"/>
         </w:rPr>
-        <w:t xml:space="preserve">Kategorie 🟠 Steuerung: Block „wiederhole fortlaufend“ darunter ziehen — alles darin läuft die ganze Zeit weiter.</w:t>
+        <w:t xml:space="preserve">Zieh darunter den Block „wiederhole fortlaufend“ (🟠 Steuerung). Alles, was jetzt hineinkommt, läuft die ganze Zeit weiter.</w:t>
       </w:r>
     </w:p>
     <w:p>
@@ -1468,7 +1390,7 @@
           <w:sz w:val="26"/>
           <w:szCs w:val="26"/>
         </w:rPr>
-        <w:t xml:space="preserve">In die Dauerschleife hinein: Kategorie 🟠 Steuerung → Block „falls &lt; &gt;, dann“.</w:t>
+        <w:t xml:space="preserve">Leg in die Dauerschleife einen „falls &lt; &gt;, dann“-Block (🟠 Steuerung).</w:t>
       </w:r>
     </w:p>
     <w:p>
@@ -1494,7 +1416,7 @@
           <w:sz w:val="26"/>
           <w:szCs w:val="26"/>
         </w:rPr>
-        <w:t xml:space="preserve">In die kleine Lücke der falls-Bedingung: Kategorie 🔷 Fühlen → Block „wird Farbe [ ] berührt?“ — dann mit der Pipette die Ufer-Farbe auf deinem Hintergrund anklicken.</w:t>
+        <w:t xml:space="preserve">Zieh in die kleine Lücke der falls-Bedingung den Block „wird Farbe [ ] berührt?“ (🔷 Fühlen) und klick dann mit der Pipette die Ufer-Farbe auf deinem Hintergrund an.</w:t>
       </w:r>
     </w:p>
     <w:p>
@@ -1520,7 +1442,7 @@
           <w:sz w:val="26"/>
           <w:szCs w:val="26"/>
         </w:rPr>
-        <w:t xml:space="preserve">In den falls...dann-Block hinein: nochmal 🔵 Bewegung → „gehe zu x: ( ) y: ( )“, gleiche Werte wie in Schritt 2.</w:t>
+        <w:t xml:space="preserve">Häng noch einmal den Block „gehe zu x: ( ) y: ( )“ (🔵 Bewegung) in den falls...dann-Block — mit denselben Werten wie in Schritt 2.</w:t>
       </w:r>
     </w:p>
     <w:tbl>
@@ -1569,7 +1491,7 @@
                 <w:sz w:val="26"/>
                 <w:szCs w:val="26"/>
               </w:rPr>
-              <w:t xml:space="preserve">Das ist der kniffligste Schritt heute — wenn du nicht weiterkommst, ist das total okay, frag einfach!</w:t>
+              <w:t xml:space="preserve">Das ist der kniffligste Schritt heute. Wenn du nicht weiterkommst, ist das total okay, frag einfach!</w:t>
             </w:r>
           </w:p>
         </w:tc>
@@ -1867,7 +1789,7 @@
                 <w:sz w:val="26"/>
                 <w:szCs w:val="26"/>
               </w:rPr>
-              <w:t xml:space="preserve">Trage hier die tatsächliche Start-Position eures Fischs ein (z. B. x: -200 / y: -150) und wähle beim Vorführen die richtige Ufer-Farbe mit der Pipette direkt im Projekt aus — die kann hier nicht als Text abgebildet werden.</w:t>
+              <w:t xml:space="preserve">Trage hier die tatsächliche Start-Position eures Fischs ein (z. B. x: -200 / y: -150). Wähle beim Vorführen außerdem die richtige Ufer-Farbe mit der Pipette direkt im Projekt aus — die lässt sich hier nicht als Text abbilden.</w:t>
             </w:r>
           </w:p>
         </w:tc>
@@ -2043,7 +1965,7 @@
           <w:sz w:val="26"/>
           <w:szCs w:val="26"/>
         </w:rPr>
-        <w:t xml:space="preserve">Du brauchst keinen neuen Turm — ergänze deine Dauerschleife aus Schritt C um einen zweiten falls...dann-Block (🟠 Steuerung), direkt unter dem ersten, in derselben Dauerschleife.</w:t>
+        <w:t xml:space="preserve">Du brauchst keinen neuen Turm: Ergänze einfach deine Dauerschleife aus Schritt C um einen zweiten falls...dann-Block (🟠 Steuerung), direkt unter dem ersten.</w:t>
       </w:r>
     </w:p>
     <w:p>
@@ -2069,7 +1991,7 @@
           <w:sz w:val="26"/>
           <w:szCs w:val="26"/>
         </w:rPr>
-        <w:t xml:space="preserve">In die falls-Lücke: Kategorie 🔷 Fühlen → Block „wird [ ] berührt?“, dann im Dropdown deine Abenteuerspielplatz-Figur auswählen.</w:t>
+        <w:t xml:space="preserve">Zieh den Block „wird [ ] berührt?“ (🔷 Fühlen) in die neue falls-Lücke und wähl im Dropdown deine Abenteuerspielplatz-Figur aus.</w:t>
       </w:r>
     </w:p>
     <w:p>
@@ -2095,7 +2017,7 @@
           <w:sz w:val="26"/>
           <w:szCs w:val="26"/>
         </w:rPr>
-        <w:t xml:space="preserve">In den falls...dann-Block hinein: Kategorie 🟣 Aussehen → Block „sage [ ] für ( ) Sekunden“, Text „Geschafft!“ eintragen.</w:t>
+        <w:t xml:space="preserve">Häng in den falls...dann-Block den Block „sage [ ] für ( ) Sekunden“ (🟣 Aussehen) und trag den Text „Geschafft!“ ein.</w:t>
       </w:r>
     </w:p>
     <w:p>
@@ -2121,7 +2043,7 @@
           <w:sz w:val="26"/>
           <w:szCs w:val="26"/>
         </w:rPr>
-        <w:t xml:space="preserve">Darunter: Kategorie 🟠 Steuerung → Block „stoppe [alles]“.</w:t>
+        <w:t xml:space="preserve">Häng darunter noch den Block „stoppe [alles]“ (🟠 Steuerung) an.</w:t>
       </w:r>
     </w:p>
     <w:p>
@@ -2221,15 +2143,15 @@
       <w:r>
         <w:rPr>
           <w:rFonts w:ascii="Comic Sans MS" w:cs="Comic Sans MS" w:eastAsia="Comic Sans MS" w:hAnsi="Comic Sans MS"/>
-          <w:b/>
-          <w:bCs/>
+          <w:b w:val="false"/>
+          <w:bCs w:val="false"/>
           <w:i w:val="false"/>
           <w:iCs w:val="false"/>
           <w:color w:val="1A1A1A"/>
           <w:sz w:val="26"/>
           <w:szCs w:val="26"/>
         </w:rPr>
-        <w:t xml:space="preserve">Ergänzung innerhalb derselben Dauerschleife von Schritt C, als zweiter Block direkt unter dem Ufer-Check:</w:t>
+        <w:t xml:space="preserve">Zweiter Block, direkt unter dem Ufer-Check in derselben Dauerschleife:</w:t>
       </w:r>
     </w:p>
     <w:tbl>
@@ -2584,8 +2506,8 @@
       <w:r>
         <w:rPr>
           <w:rFonts w:ascii="Comic Sans MS" w:cs="Comic Sans MS" w:eastAsia="Comic Sans MS" w:hAnsi="Comic Sans MS"/>
-          <w:b/>
-          <w:bCs/>
+          <w:b w:val="false"/>
+          <w:bCs w:val="false"/>
           <w:i w:val="false"/>
           <w:iCs w:val="false"/>
           <w:color w:val="1A1A1A"/>
@@ -2698,7 +2620,7 @@
           <w:sz w:val="26"/>
           <w:szCs w:val="26"/>
         </w:rPr>
-        <w:t xml:space="preserve">Kategorie 🟡 Ereignisse: „wenn grüne Fahne 🟢 angeklickt wird“</w:t>
+        <w:t xml:space="preserve">Den Block „wenn grüne Fahne 🟢 angeklickt wird“ (🟡 Ereignisse).</w:t>
       </w:r>
     </w:p>
     <w:p>
@@ -2724,7 +2646,7 @@
           <w:sz w:val="26"/>
           <w:szCs w:val="26"/>
         </w:rPr>
-        <w:t xml:space="preserve">Kategorie 🟠 Steuerung: „wiederhole fortlaufend“</w:t>
+        <w:t xml:space="preserve">Darunter den Block „wiederhole fortlaufend“ (🟠 Steuerung).</w:t>
       </w:r>
     </w:p>
     <w:p>
@@ -2750,7 +2672,7 @@
           <w:sz w:val="26"/>
           <w:szCs w:val="26"/>
         </w:rPr>
-        <w:t xml:space="preserve">Darin: Kategorie 🔵 Bewegung: „gehe ( ) Schritte“ und „pralle vom Rand ab“</w:t>
+        <w:t xml:space="preserve">Darin die Blöcke „gehe ( ) Schritte“ und „pralle vom Rand ab“ (beide 🔵 Bewegung).</w:t>
       </w:r>
     </w:p>
     <w:p>
@@ -2784,7 +2706,7 @@
           <w:sz w:val="26"/>
           <w:szCs w:val="26"/>
         </w:rPr>
-        <w:t xml:space="preserve">Klick wieder deine Fisch-Figur an. Baue einen dritten falls...dann-Block in deine bestehende Dauerschleife aus Schritt C/D — genau nach demselben Muster wie beim Ufer, nur diesmal mit „wird Angel berührt?“.</w:t>
+        <w:t xml:space="preserve">Klick wieder deine Fisch-Figur an und bau in die bestehende Dauerschleife einen dritten falls...dann-Block: gleiches Muster wie beim Ufer, diesmal mit „wird Angel berührt?“.</w:t>
       </w:r>
     </w:p>
     <w:p>
@@ -2884,8 +2806,8 @@
       <w:r>
         <w:rPr>
           <w:rFonts w:ascii="Comic Sans MS" w:cs="Comic Sans MS" w:eastAsia="Comic Sans MS" w:hAnsi="Comic Sans MS"/>
-          <w:b/>
-          <w:bCs/>
+          <w:b w:val="false"/>
+          <w:bCs w:val="false"/>
           <w:i w:val="false"/>
           <w:iCs w:val="false"/>
           <w:color w:val="1A1A1A"/>
@@ -3031,15 +2953,15 @@
       <w:r>
         <w:rPr>
           <w:rFonts w:ascii="Comic Sans MS" w:cs="Comic Sans MS" w:eastAsia="Comic Sans MS" w:hAnsi="Comic Sans MS"/>
-          <w:b/>
-          <w:bCs/>
+          <w:b w:val="false"/>
+          <w:bCs w:val="false"/>
           <w:i w:val="false"/>
           <w:iCs w:val="false"/>
           <w:color w:val="1A1A1A"/>
           <w:sz w:val="26"/>
           <w:szCs w:val="26"/>
         </w:rPr>
-        <w:t xml:space="preserve">Ergänzung auf der Fisch-Figur, dritter falls...dann in der bekannten Dauerschleife:</w:t>
+        <w:t xml:space="preserve">Dritter falls...dann auf der Fisch-Figur, in der bekannten Dauerschleife:</w:t>
       </w:r>
     </w:p>
     <w:tbl>
@@ -3117,58 +3039,31 @@
         <w:spacing w:after="160"/>
       </w:pPr>
     </w:p>
-    <w:tbl>
-      <w:tblPr>
-        <w:tblW w:type="dxa" w:w="10206"/>
-        <w:tblBorders>
-          <w:top w:val="single" w:color="E8B923" w:sz="8"/>
-          <w:left w:val="single" w:color="E8B923" w:sz="8"/>
-          <w:bottom w:val="single" w:color="E8B923" w:sz="8"/>
-          <w:right w:val="single" w:color="E8B923" w:sz="8"/>
-          <w:insideH w:val="none" w:color="FFFFFF" w:sz="0"/>
-          <w:insideV w:val="none" w:color="FFFFFF" w:sz="0"/>
-        </w:tblBorders>
-      </w:tblPr>
-      <w:tblGrid>
-        <w:gridCol w:w="10206"/>
-      </w:tblGrid>
-      <w:tr>
-        <w:tc>
-          <w:tcPr>
-            <w:tcW w:type="dxa" w:w="10206"/>
-            <w:shd w:fill="FFF6D9" w:val="clear"/>
-            <w:tcMar>
-              <w:top w:type="dxa" w:w="160"/>
-              <w:left w:type="dxa" w:w="220"/>
-              <w:bottom w:type="dxa" w:w="160"/>
-              <w:right w:type="dxa" w:w="220"/>
-            </w:tcMar>
-          </w:tcPr>
-          <w:p>
-            <w:r>
-              <w:rPr>
-                <w:rFonts w:ascii="Comic Sans MS" w:cs="Comic Sans MS" w:eastAsia="Comic Sans MS" w:hAnsi="Comic Sans MS"/>
-                <w:b/>
-                <w:bCs/>
-                <w:color w:val="7A5B00"/>
-                <w:sz w:val="26"/>
-                <w:szCs w:val="26"/>
-              </w:rPr>
-              <w:t xml:space="preserve">💡 Tipp: </w:t>
-            </w:r>
-            <w:r>
-              <w:rPr>
-                <w:rFonts w:ascii="Comic Sans MS" w:cs="Comic Sans MS" w:eastAsia="Comic Sans MS" w:hAnsi="Comic Sans MS"/>
-                <w:color w:val="1A1A1A"/>
-                <w:sz w:val="26"/>
-                <w:szCs w:val="26"/>
-              </w:rPr>
-              <w:t xml:space="preserve">Achte darauf, dass dieser neue Block vor dem „Geschafft!“-Block aus Schritt D steht, sonst könnte es komisch aussehen, wenn beides gleichzeitig passiert.</w:t>
-            </w:r>
-          </w:p>
-        </w:tc>
-      </w:tr>
-    </w:tbl>
+    <w:p>
+      <w:pPr>
+        <w:spacing w:after="80" w:before="80"/>
+      </w:pPr>
+      <w:r>
+        <w:rPr>
+          <w:rFonts w:ascii="Comic Sans MS" w:cs="Comic Sans MS" w:eastAsia="Comic Sans MS" w:hAnsi="Comic Sans MS"/>
+          <w:b/>
+          <w:bCs/>
+          <w:color w:val="1A1A1A"/>
+          <w:sz w:val="26"/>
+          <w:szCs w:val="26"/>
+        </w:rPr>
+        <w:t xml:space="preserve">Achtung, Reihenfolge: </w:t>
+      </w:r>
+      <w:r>
+        <w:rPr>
+          <w:rFonts w:ascii="Comic Sans MS" w:cs="Comic Sans MS" w:eastAsia="Comic Sans MS" w:hAnsi="Comic Sans MS"/>
+          <w:color w:val="1A1A1A"/>
+          <w:sz w:val="26"/>
+          <w:szCs w:val="26"/>
+        </w:rPr>
+        <w:t xml:space="preserve">Dieser neue Block muss vor dem „Geschafft!“-Block aus Schritt D stehen, sonst können beide Meldungen gleichzeitig auftauchen.</w:t>
+      </w:r>
+    </w:p>
     <w:p>
       <w:pPr>
         <w:spacing w:after="160"/>
@@ -3266,8 +3161,8 @@
       <w:r>
         <w:rPr>
           <w:rFonts w:ascii="Comic Sans MS" w:cs="Comic Sans MS" w:eastAsia="Comic Sans MS" w:hAnsi="Comic Sans MS"/>
-          <w:b/>
-          <w:bCs/>
+          <w:b w:val="false"/>
+          <w:bCs w:val="false"/>
           <w:i w:val="false"/>
           <w:iCs w:val="false"/>
           <w:color w:val="1A1A1A"/>
@@ -3354,7 +3249,7 @@
           <w:sz w:val="26"/>
           <w:szCs w:val="26"/>
         </w:rPr>
-        <w:t xml:space="preserve">Klick die Ente-Figur an und bau nach genau demselben Muster wie bei der Angel in Schritt E:</w:t>
+        <w:t xml:space="preserve">Klick die Ente-Figur an. Der Aufbau ist genau derselbe wie bei der Angel in Schritt E:</w:t>
       </w:r>
     </w:p>
     <w:p>
@@ -3380,7 +3275,7 @@
           <w:sz w:val="26"/>
           <w:szCs w:val="26"/>
         </w:rPr>
-        <w:t xml:space="preserve">Kategorie 🟡 Ereignisse: „wenn grüne Fahne 🟢 angeklickt wird“</w:t>
+        <w:t xml:space="preserve">Den Block „wenn grüne Fahne 🟢 angeklickt wird“ (🟡 Ereignisse).</w:t>
       </w:r>
     </w:p>
     <w:p>
@@ -3406,7 +3301,7 @@
           <w:sz w:val="26"/>
           <w:szCs w:val="26"/>
         </w:rPr>
-        <w:t xml:space="preserve">Kategorie 🟠 Steuerung: „wiederhole fortlaufend“</w:t>
+        <w:t xml:space="preserve">Darunter den Block „wiederhole fortlaufend“ (🟠 Steuerung).</w:t>
       </w:r>
     </w:p>
     <w:p>
@@ -3432,7 +3327,7 @@
           <w:sz w:val="26"/>
           <w:szCs w:val="26"/>
         </w:rPr>
-        <w:t xml:space="preserve">Darin: Kategorie 🔵 Bewegung: „gehe ( ) Schritte“ und „pralle vom Rand ab“</w:t>
+        <w:t xml:space="preserve">Darin die Blöcke „gehe ( ) Schritte“ und „pralle vom Rand ab“ (beide 🔵 Bewegung).</w:t>
       </w:r>
     </w:p>
     <w:tbl>
@@ -3481,7 +3376,7 @@
                 <w:sz w:val="26"/>
                 <w:szCs w:val="26"/>
               </w:rPr>
-              <w:t xml:space="preserve">Damit die Ente hoch und runter statt links-rechts patrouilliert (spannender, weil anders als die Angel!), ergänze vor der Dauerschleife noch: Kategorie 🔵 Bewegung → Block „setze Richtung auf ( ) Grad“ mit dem Wert 0.</w:t>
+              <w:t xml:space="preserve">Damit die Ente hoch und runter patrouilliert statt links-rechts wie die Angel, ergänze vor der Dauerschleife noch den Block „setze Richtung auf ( ) Grad“ (🔵 Bewegung) mit dem Wert 0 — dann wird's abwechslungsreicher.</w:t>
             </w:r>
           </w:p>
         </w:tc>
@@ -3518,7 +3413,7 @@
           <w:sz w:val="26"/>
           <w:szCs w:val="26"/>
         </w:rPr>
-        <w:t xml:space="preserve">Klick wieder deine Fisch-Figur an. Baue einen vierten falls...dann-Block in deine bestehende Dauerschleife — genau nach demselben Muster wie bei Ufer und Angel, nur diesmal mit „wird Ente berührt?“.</w:t>
+        <w:t xml:space="preserve">Klick wieder deine Fisch-Figur an. Jetzt kommt ein vierter falls...dann-Block in dieselbe Dauerschleife dazu — Bedingung diesmal: „wird Ente berührt?“, Wirkung genau wie bei Ufer und Angel.</w:t>
       </w:r>
     </w:p>
     <w:p>
@@ -3618,8 +3513,8 @@
       <w:r>
         <w:rPr>
           <w:rFonts w:ascii="Comic Sans MS" w:cs="Comic Sans MS" w:eastAsia="Comic Sans MS" w:hAnsi="Comic Sans MS"/>
-          <w:b/>
-          <w:bCs/>
+          <w:b w:val="false"/>
+          <w:bCs w:val="false"/>
           <w:i w:val="false"/>
           <w:iCs w:val="false"/>
           <w:color w:val="1A1A1A"/>
@@ -3792,15 +3687,15 @@
       <w:r>
         <w:rPr>
           <w:rFonts w:ascii="Comic Sans MS" w:cs="Comic Sans MS" w:eastAsia="Comic Sans MS" w:hAnsi="Comic Sans MS"/>
-          <w:b/>
-          <w:bCs/>
+          <w:b w:val="false"/>
+          <w:bCs w:val="false"/>
           <w:i w:val="false"/>
           <w:iCs w:val="false"/>
           <w:color w:val="1A1A1A"/>
           <w:sz w:val="26"/>
           <w:szCs w:val="26"/>
         </w:rPr>
-        <w:t xml:space="preserve">Ergänzung auf der Fisch-Figur, vierter falls...dann in der bekannten Dauerschleife:</w:t>
+        <w:t xml:space="preserve">Vierter falls...dann auf der Fisch-Figur, wieder in derselben Dauerschleife:</w:t>
       </w:r>
     </w:p>
     <w:tbl>
@@ -3878,58 +3773,31 @@
         <w:spacing w:after="160"/>
       </w:pPr>
     </w:p>
-    <w:tbl>
-      <w:tblPr>
-        <w:tblW w:type="dxa" w:w="10206"/>
-        <w:tblBorders>
-          <w:top w:val="single" w:color="E8B923" w:sz="8"/>
-          <w:left w:val="single" w:color="E8B923" w:sz="8"/>
-          <w:bottom w:val="single" w:color="E8B923" w:sz="8"/>
-          <w:right w:val="single" w:color="E8B923" w:sz="8"/>
-          <w:insideH w:val="none" w:color="FFFFFF" w:sz="0"/>
-          <w:insideV w:val="none" w:color="FFFFFF" w:sz="0"/>
-        </w:tblBorders>
-      </w:tblPr>
-      <w:tblGrid>
-        <w:gridCol w:w="10206"/>
-      </w:tblGrid>
-      <w:tr>
-        <w:tc>
-          <w:tcPr>
-            <w:tcW w:type="dxa" w:w="10206"/>
-            <w:shd w:fill="FFF6D9" w:val="clear"/>
-            <w:tcMar>
-              <w:top w:type="dxa" w:w="160"/>
-              <w:left w:type="dxa" w:w="220"/>
-              <w:bottom w:type="dxa" w:w="160"/>
-              <w:right w:type="dxa" w:w="220"/>
-            </w:tcMar>
-          </w:tcPr>
-          <w:p>
-            <w:r>
-              <w:rPr>
-                <w:rFonts w:ascii="Comic Sans MS" w:cs="Comic Sans MS" w:eastAsia="Comic Sans MS" w:hAnsi="Comic Sans MS"/>
-                <w:b/>
-                <w:bCs/>
-                <w:color w:val="7A5B00"/>
-                <w:sz w:val="26"/>
-                <w:szCs w:val="26"/>
-              </w:rPr>
-              <w:t xml:space="preserve">💡 Tipp: </w:t>
-            </w:r>
-            <w:r>
-              <w:rPr>
-                <w:rFonts w:ascii="Comic Sans MS" w:cs="Comic Sans MS" w:eastAsia="Comic Sans MS" w:hAnsi="Comic Sans MS"/>
-                <w:color w:val="1A1A1A"/>
-                <w:sz w:val="26"/>
-                <w:szCs w:val="26"/>
-              </w:rPr>
-              <w:t xml:space="preserve">Jetzt hat dein Fisch zwei Gegner gleichzeitig im Weg — Angel und Ente. Wenn das zu leicht ist: Erhöh einfach die Zahl bei „gehe ( ) Schritte“ bei beiden, damit sie schneller patrouillieren!</w:t>
-            </w:r>
-          </w:p>
-        </w:tc>
-      </w:tr>
-    </w:tbl>
+    <w:p>
+      <w:pPr>
+        <w:spacing w:after="80" w:before="80"/>
+      </w:pPr>
+      <w:r>
+        <w:rPr>
+          <w:rFonts w:ascii="Comic Sans MS" w:cs="Comic Sans MS" w:eastAsia="Comic Sans MS" w:hAnsi="Comic Sans MS"/>
+          <w:b/>
+          <w:bCs/>
+          <w:color w:val="1A1A1A"/>
+          <w:sz w:val="26"/>
+          <w:szCs w:val="26"/>
+        </w:rPr>
+        <w:t xml:space="preserve">Profi-Tipp: </w:t>
+      </w:r>
+      <w:r>
+        <w:rPr>
+          <w:rFonts w:ascii="Comic Sans MS" w:cs="Comic Sans MS" w:eastAsia="Comic Sans MS" w:hAnsi="Comic Sans MS"/>
+          <w:color w:val="1A1A1A"/>
+          <w:sz w:val="26"/>
+          <w:szCs w:val="26"/>
+        </w:rPr>
+        <w:t xml:space="preserve">Jetzt hat dein Fisch zwei Gegner gleichzeitig im Weg, Angel und Ente. Falls das zu leicht ist: Erhöh einfach die Zahl bei „gehe ( ) Schritte“, dann patrouillieren beide schneller.</w:t>
+      </w:r>
+    </w:p>
     <w:p>
       <w:pPr>
         <w:spacing w:after="160"/>

</xml_diff>

<commit_message>
Add card instructions PDF and update DOCX
The card instructions were revised and exported as a new PDF while the source DOCX was refreshed to match. This keeps the printable handout available in both editable and distributable formats.
</commit_message>
<xml_diff>
--- a/kurs/anleitung-karten.docx
+++ b/kurs/anleitung-karten.docx
@@ -241,12 +241,6 @@
         <w:gridCol w:w="10206"/>
       </w:tblGrid>
       <w:tr>
-        <w:tblPrEx>
-          <w:tblCellMar>
-            <w:top w:w="0" w:type="dxa"/>
-            <w:bottom w:w="0" w:type="dxa"/>
-          </w:tblCellMar>
-        </w:tblPrEx>
         <w:tc>
           <w:tcPr>
             <w:tcW w:w="10206" w:type="dxa"/>
@@ -279,6 +273,7 @@
             </w:r>
             <w:r>
               <w:rPr>
+                <w:noProof/>
                 <w:color w:val="1A1A1A"/>
                 <w:sz w:val="26"/>
                 <w:szCs w:val="26"/>
@@ -343,10 +338,10 @@
       </w:pPr>
       <w:r>
         <w:drawing>
-          <wp:inline distT="0" distB="0" distL="0" distR="0" wp14:anchorId="7C84AEE8" wp14:editId="0936F8D7">
-            <wp:extent cx="5547841" cy="4206605"/>
-            <wp:effectExtent l="0" t="0" r="0" b="3810"/>
-            <wp:docPr id="1070361141" name="Grafik 1"/>
+          <wp:inline distT="0" distB="0" distL="0" distR="0" wp14:anchorId="2B30EE1E" wp14:editId="79B0792F">
+            <wp:extent cx="5214232" cy="3939540"/>
+            <wp:effectExtent l="0" t="0" r="5715" b="3810"/>
+            <wp:docPr id="1682266444" name="Grafik 1"/>
             <wp:cNvGraphicFramePr>
               <a:graphicFrameLocks xmlns:a="http://schemas.openxmlformats.org/drawingml/2006/main" noChangeAspect="1"/>
             </wp:cNvGraphicFramePr>
@@ -354,7 +349,7 @@
               <a:graphicData uri="http://schemas.openxmlformats.org/drawingml/2006/picture">
                 <pic:pic xmlns:pic="http://schemas.openxmlformats.org/drawingml/2006/picture">
                   <pic:nvPicPr>
-                    <pic:cNvPr id="1070361141" name=""/>
+                    <pic:cNvPr id="1682266444" name=""/>
                     <pic:cNvPicPr/>
                   </pic:nvPicPr>
                   <pic:blipFill>
@@ -366,7 +361,7 @@
                   <pic:spPr>
                     <a:xfrm>
                       <a:off x="0" y="0"/>
-                      <a:ext cx="5547841" cy="4206605"/>
+                      <a:ext cx="5217594" cy="3942080"/>
                     </a:xfrm>
                     <a:prstGeom prst="rect">
                       <a:avLst/>
@@ -475,6 +470,7 @@
       </w:r>
       <w:r>
         <w:rPr>
+          <w:noProof/>
           <w:color w:val="1A1A1A"/>
           <w:sz w:val="26"/>
           <w:szCs w:val="26"/>
@@ -613,6 +609,7 @@
       </w:r>
       <w:r>
         <w:rPr>
+          <w:noProof/>
           <w:color w:val="1A1A1A"/>
           <w:sz w:val="26"/>
           <w:szCs w:val="26"/>
@@ -795,12 +792,6 @@
         <w:gridCol w:w="10206"/>
       </w:tblGrid>
       <w:tr>
-        <w:tblPrEx>
-          <w:tblCellMar>
-            <w:top w:w="0" w:type="dxa"/>
-            <w:bottom w:w="0" w:type="dxa"/>
-          </w:tblCellMar>
-        </w:tblPrEx>
         <w:tc>
           <w:tcPr>
             <w:tcW w:w="10206" w:type="dxa"/>
@@ -829,7 +820,23 @@
                 <w:sz w:val="26"/>
                 <w:szCs w:val="26"/>
               </w:rPr>
-              <w:t>Für „rechts“ und „oben“ nimmst du eine positive Zahl (z. B. 10), für „links“ und „unten“ eine negative Zahl (z. B. -10). Probier ruhig aus, wie schnell dein Fisch schwimmen soll!</w:t>
+              <w:t>Für „rechts“ und „oben“ nimmst du eine positive Zahl (z. B. 10), für „links“ und „unten“ eine negative Zahl (z. B. -10). Probier</w:t>
+            </w:r>
+            <w:r>
+              <w:rPr>
+                <w:color w:val="1A1A1A"/>
+                <w:sz w:val="26"/>
+                <w:szCs w:val="26"/>
+              </w:rPr>
+              <w:t>e</w:t>
+            </w:r>
+            <w:r>
+              <w:rPr>
+                <w:color w:val="1A1A1A"/>
+                <w:sz w:val="26"/>
+                <w:szCs w:val="26"/>
+              </w:rPr>
+              <w:t xml:space="preserve"> ruhig aus, wie schnell dein Fisch schwimmen soll!</w:t>
             </w:r>
           </w:p>
         </w:tc>
@@ -846,6 +853,9 @@
         <w:jc w:val="center"/>
       </w:pPr>
       <w:r>
+        <w:rPr>
+          <w:noProof/>
+        </w:rPr>
         <w:drawing>
           <wp:inline distT="0" distB="0" distL="0" distR="0" wp14:anchorId="0FC49B61" wp14:editId="04897ED5">
             <wp:extent cx="5273497" cy="1988992"/>
@@ -932,6 +942,9 @@
         <w:spacing w:after="160"/>
       </w:pPr>
       <w:r>
+        <w:rPr>
+          <w:noProof/>
+        </w:rPr>
         <w:drawing>
           <wp:inline distT="0" distB="0" distL="0" distR="0" wp14:anchorId="1FAE9E29" wp14:editId="732DF2E5">
             <wp:extent cx="6480810" cy="4520565"/>
@@ -1073,6 +1086,7 @@
       </w:r>
       <w:r>
         <w:rPr>
+          <w:noProof/>
           <w:color w:val="1A1A1A"/>
           <w:sz w:val="26"/>
           <w:szCs w:val="26"/>
@@ -1147,15 +1161,16 @@
       </w:r>
       <w:r>
         <w:rPr>
+          <w:noProof/>
           <w:color w:val="1A1A1A"/>
           <w:sz w:val="26"/>
           <w:szCs w:val="26"/>
         </w:rPr>
         <w:drawing>
-          <wp:inline distT="0" distB="0" distL="0" distR="0" wp14:anchorId="2DD2A740" wp14:editId="33BD69CE">
-            <wp:extent cx="2186940" cy="621879"/>
-            <wp:effectExtent l="0" t="0" r="3810" b="6985"/>
-            <wp:docPr id="1408185141" name="Grafik 1"/>
+          <wp:inline distT="0" distB="0" distL="0" distR="0" wp14:anchorId="14234746" wp14:editId="3E504C4E">
+            <wp:extent cx="1493520" cy="471952"/>
+            <wp:effectExtent l="0" t="0" r="0" b="4445"/>
+            <wp:docPr id="522029309" name="Grafik 1"/>
             <wp:cNvGraphicFramePr>
               <a:graphicFrameLocks xmlns:a="http://schemas.openxmlformats.org/drawingml/2006/main" noChangeAspect="1"/>
             </wp:cNvGraphicFramePr>
@@ -1163,7 +1178,7 @@
               <a:graphicData uri="http://schemas.openxmlformats.org/drawingml/2006/picture">
                 <pic:pic xmlns:pic="http://schemas.openxmlformats.org/drawingml/2006/picture">
                   <pic:nvPicPr>
-                    <pic:cNvPr id="1408185141" name=""/>
+                    <pic:cNvPr id="522029309" name=""/>
                     <pic:cNvPicPr/>
                   </pic:nvPicPr>
                   <pic:blipFill>
@@ -1175,7 +1190,7 @@
                   <pic:spPr>
                     <a:xfrm>
                       <a:off x="0" y="0"/>
-                      <a:ext cx="2216624" cy="630320"/>
+                      <a:ext cx="1516068" cy="479077"/>
                     </a:xfrm>
                     <a:prstGeom prst="rect">
                       <a:avLst/>
@@ -1229,6 +1244,7 @@
       </w:r>
       <w:r>
         <w:rPr>
+          <w:noProof/>
           <w:color w:val="1A1A1A"/>
           <w:sz w:val="26"/>
           <w:szCs w:val="26"/>
@@ -1311,6 +1327,7 @@
       </w:r>
       <w:r>
         <w:rPr>
+          <w:noProof/>
           <w:color w:val="1A1A1A"/>
           <w:sz w:val="26"/>
           <w:szCs w:val="26"/>
@@ -1381,7 +1398,75 @@
           <w:sz w:val="26"/>
           <w:szCs w:val="26"/>
         </w:rPr>
-        <w:t>Zieh in die kleine Lücke der falls-Bedingung den Block „wird Farbe [ ] berührt?“ (Fühlen) und klick dann mit der Pipette die Ufer-Farbe auf deinem Hintergrund an.</w:t>
+        <w:t xml:space="preserve">Zieh in die kleine Lücke der </w:t>
+      </w:r>
+      <w:proofErr w:type="spellStart"/>
+      <w:r>
+        <w:rPr>
+          <w:color w:val="1A1A1A"/>
+          <w:sz w:val="26"/>
+          <w:szCs w:val="26"/>
+        </w:rPr>
+        <w:t>falls</w:t>
+      </w:r>
+      <w:proofErr w:type="spellEnd"/>
+      <w:r>
+        <w:rPr>
+          <w:color w:val="1A1A1A"/>
+          <w:sz w:val="26"/>
+          <w:szCs w:val="26"/>
+        </w:rPr>
+        <w:t xml:space="preserve">-Bedingung den Block </w:t>
+      </w:r>
+      <w:r>
+        <w:rPr>
+          <w:color w:val="1A1A1A"/>
+          <w:sz w:val="26"/>
+          <w:szCs w:val="26"/>
+        </w:rPr>
+        <w:drawing>
+          <wp:inline distT="0" distB="0" distL="0" distR="0" wp14:anchorId="35FF6362" wp14:editId="460A11F6">
+            <wp:extent cx="1554480" cy="374107"/>
+            <wp:effectExtent l="0" t="0" r="7620" b="6985"/>
+            <wp:docPr id="629231116" name="Grafik 1"/>
+            <wp:cNvGraphicFramePr>
+              <a:graphicFrameLocks xmlns:a="http://schemas.openxmlformats.org/drawingml/2006/main" noChangeAspect="1"/>
+            </wp:cNvGraphicFramePr>
+            <a:graphic xmlns:a="http://schemas.openxmlformats.org/drawingml/2006/main">
+              <a:graphicData uri="http://schemas.openxmlformats.org/drawingml/2006/picture">
+                <pic:pic xmlns:pic="http://schemas.openxmlformats.org/drawingml/2006/picture">
+                  <pic:nvPicPr>
+                    <pic:cNvPr id="629231116" name=""/>
+                    <pic:cNvPicPr/>
+                  </pic:nvPicPr>
+                  <pic:blipFill>
+                    <a:blip r:embed="rId17"/>
+                    <a:stretch>
+                      <a:fillRect/>
+                    </a:stretch>
+                  </pic:blipFill>
+                  <pic:spPr>
+                    <a:xfrm>
+                      <a:off x="0" y="0"/>
+                      <a:ext cx="1564933" cy="376623"/>
+                    </a:xfrm>
+                    <a:prstGeom prst="rect">
+                      <a:avLst/>
+                    </a:prstGeom>
+                  </pic:spPr>
+                </pic:pic>
+              </a:graphicData>
+            </a:graphic>
+          </wp:inline>
+        </w:drawing>
+      </w:r>
+      <w:r>
+        <w:rPr>
+          <w:color w:val="1A1A1A"/>
+          <w:sz w:val="26"/>
+          <w:szCs w:val="26"/>
+        </w:rPr>
+        <w:t xml:space="preserve"> (Fühlen) und klick dann mit der Pipette die Ufer-Farbe auf deinem Hintergrund an.</w:t>
       </w:r>
     </w:p>
     <w:p>
@@ -1405,7 +1490,66 @@
           <w:sz w:val="26"/>
           <w:szCs w:val="26"/>
         </w:rPr>
-        <w:t>Häng noch einmal den Block „gehe zu x: ( ) y: ( )“ (🔵 Bewegung) in den falls...dann-Block — mit denselben Werten wie in Schritt 2.</w:t>
+        <w:t xml:space="preserve">Häng noch einmal den Block </w:t>
+      </w:r>
+      <w:r>
+        <w:rPr>
+          <w:noProof/>
+          <w:color w:val="1A1A1A"/>
+          <w:sz w:val="26"/>
+          <w:szCs w:val="26"/>
+        </w:rPr>
+        <w:drawing>
+          <wp:inline distT="0" distB="0" distL="0" distR="0" wp14:anchorId="149979FB" wp14:editId="5EE95E3C">
+            <wp:extent cx="1493520" cy="471952"/>
+            <wp:effectExtent l="0" t="0" r="0" b="4445"/>
+            <wp:docPr id="545459560" name="Grafik 1"/>
+            <wp:cNvGraphicFramePr>
+              <a:graphicFrameLocks xmlns:a="http://schemas.openxmlformats.org/drawingml/2006/main" noChangeAspect="1"/>
+            </wp:cNvGraphicFramePr>
+            <a:graphic xmlns:a="http://schemas.openxmlformats.org/drawingml/2006/main">
+              <a:graphicData uri="http://schemas.openxmlformats.org/drawingml/2006/picture">
+                <pic:pic xmlns:pic="http://schemas.openxmlformats.org/drawingml/2006/picture">
+                  <pic:nvPicPr>
+                    <pic:cNvPr id="522029309" name=""/>
+                    <pic:cNvPicPr/>
+                  </pic:nvPicPr>
+                  <pic:blipFill>
+                    <a:blip r:embed="rId14"/>
+                    <a:stretch>
+                      <a:fillRect/>
+                    </a:stretch>
+                  </pic:blipFill>
+                  <pic:spPr>
+                    <a:xfrm>
+                      <a:off x="0" y="0"/>
+                      <a:ext cx="1516068" cy="479077"/>
+                    </a:xfrm>
+                    <a:prstGeom prst="rect">
+                      <a:avLst/>
+                    </a:prstGeom>
+                  </pic:spPr>
+                </pic:pic>
+              </a:graphicData>
+            </a:graphic>
+          </wp:inline>
+        </w:drawing>
+      </w:r>
+      <w:r>
+        <w:rPr>
+          <w:color w:val="1A1A1A"/>
+          <w:sz w:val="26"/>
+          <w:szCs w:val="26"/>
+        </w:rPr>
+        <w:t xml:space="preserve"> </w:t>
+      </w:r>
+      <w:r>
+        <w:rPr>
+          <w:color w:val="1A1A1A"/>
+          <w:sz w:val="26"/>
+          <w:szCs w:val="26"/>
+        </w:rPr>
+        <w:t>(Bewegung) in den falls...dann-Block — mit denselben Werten wie in Schritt 2.</w:t>
       </w:r>
     </w:p>
     <w:tbl>
@@ -1429,12 +1573,6 @@
         <w:gridCol w:w="10206"/>
       </w:tblGrid>
       <w:tr>
-        <w:tblPrEx>
-          <w:tblCellMar>
-            <w:top w:w="0" w:type="dxa"/>
-            <w:bottom w:w="0" w:type="dxa"/>
-          </w:tblCellMar>
-        </w:tblPrEx>
         <w:tc>
           <w:tcPr>
             <w:tcW w:w="10206" w:type="dxa"/>
@@ -1474,79 +1612,6 @@
         <w:spacing w:after="160"/>
       </w:pPr>
     </w:p>
-    <w:tbl>
-      <w:tblPr>
-        <w:tblW w:w="10206" w:type="dxa"/>
-        <w:tblBorders>
-          <w:top w:val="dashed" w:sz="8" w:space="0" w:color="AAAAAA"/>
-          <w:left w:val="dashed" w:sz="8" w:space="0" w:color="AAAAAA"/>
-          <w:bottom w:val="dashed" w:sz="8" w:space="0" w:color="AAAAAA"/>
-          <w:right w:val="dashed" w:sz="8" w:space="0" w:color="AAAAAA"/>
-          <w:insideH w:val="none" w:sz="0" w:space="0" w:color="FFFFFF"/>
-          <w:insideV w:val="none" w:sz="0" w:space="0" w:color="FFFFFF"/>
-        </w:tblBorders>
-        <w:tblCellMar>
-          <w:left w:w="10" w:type="dxa"/>
-          <w:right w:w="10" w:type="dxa"/>
-        </w:tblCellMar>
-        <w:tblLook w:val="04A0" w:firstRow="1" w:lastRow="0" w:firstColumn="1" w:lastColumn="0" w:noHBand="0" w:noVBand="1"/>
-      </w:tblPr>
-      <w:tblGrid>
-        <w:gridCol w:w="10206"/>
-      </w:tblGrid>
-      <w:tr>
-        <w:tblPrEx>
-          <w:tblCellMar>
-            <w:top w:w="0" w:type="dxa"/>
-            <w:bottom w:w="0" w:type="dxa"/>
-          </w:tblCellMar>
-        </w:tblPrEx>
-        <w:tc>
-          <w:tcPr>
-            <w:tcW w:w="10206" w:type="dxa"/>
-            <w:shd w:val="clear" w:color="auto" w:fill="F4F4F4"/>
-            <w:tcMar>
-              <w:top w:w="160" w:type="dxa"/>
-              <w:left w:w="220" w:type="dxa"/>
-              <w:bottom w:w="160" w:type="dxa"/>
-              <w:right w:w="220" w:type="dxa"/>
-            </w:tcMar>
-          </w:tcPr>
-          <w:p>
-            <w:pPr>
-              <w:spacing w:before="320" w:after="320"/>
-              <w:jc w:val="center"/>
-            </w:pPr>
-            <w:r>
-              <w:rPr>
-                <w:b/>
-                <w:bCs/>
-                <w:color w:val="666666"/>
-                <w:sz w:val="26"/>
-                <w:szCs w:val="26"/>
-              </w:rPr>
-              <w:t>🖼️  Platz für Screenshot</w:t>
-            </w:r>
-          </w:p>
-          <w:p>
-            <w:pPr>
-              <w:spacing w:after="320"/>
-              <w:jc w:val="center"/>
-            </w:pPr>
-            <w:r>
-              <w:rPr>
-                <w:i/>
-                <w:iCs/>
-                <w:color w:val="888888"/>
-                <w:sz w:val="22"/>
-                <w:szCs w:val="22"/>
-              </w:rPr>
-              <w:t>leere Steuerung- und Fühlen-Kategorie</w:t>
-            </w:r>
-          </w:p>
-        </w:tc>
-      </w:tr>
-    </w:tbl>
     <w:p>
       <w:pPr>
         <w:pageBreakBefore/>
@@ -1568,243 +1633,49 @@
         <w:t>🔑 Lösung – Schritt C</w:t>
       </w:r>
     </w:p>
-    <w:tbl>
-      <w:tblPr>
-        <w:tblW w:w="10206" w:type="dxa"/>
-        <w:tblBorders>
-          <w:top w:val="single" w:sz="8" w:space="0" w:color="333333"/>
-          <w:left w:val="single" w:sz="8" w:space="0" w:color="333333"/>
-          <w:bottom w:val="single" w:sz="8" w:space="0" w:color="333333"/>
-          <w:right w:val="single" w:sz="8" w:space="0" w:color="333333"/>
-          <w:insideH w:val="single" w:sz="2" w:space="0" w:color="FFFFFF"/>
-          <w:insideV w:val="none" w:sz="0" w:space="0" w:color="FFFFFF"/>
-        </w:tblBorders>
-        <w:tblCellMar>
-          <w:left w:w="10" w:type="dxa"/>
-          <w:right w:w="10" w:type="dxa"/>
-        </w:tblCellMar>
-        <w:tblLook w:val="04A0" w:firstRow="1" w:lastRow="0" w:firstColumn="1" w:lastColumn="0" w:noHBand="0" w:noVBand="1"/>
-      </w:tblPr>
-      <w:tblGrid>
-        <w:gridCol w:w="10206"/>
-      </w:tblGrid>
-      <w:tr>
-        <w:tblPrEx>
-          <w:tblCellMar>
-            <w:top w:w="0" w:type="dxa"/>
-            <w:bottom w:w="0" w:type="dxa"/>
-          </w:tblCellMar>
-        </w:tblPrEx>
-        <w:tc>
-          <w:tcPr>
-            <w:tcW w:w="10206" w:type="dxa"/>
-            <w:shd w:val="clear" w:color="auto" w:fill="FFBF00"/>
-            <w:tcMar>
-              <w:top w:w="110" w:type="dxa"/>
-              <w:left w:w="260" w:type="dxa"/>
-              <w:bottom w:w="110" w:type="dxa"/>
-              <w:right w:w="200" w:type="dxa"/>
-            </w:tcMar>
-          </w:tcPr>
-          <w:p>
-            <w:r>
-              <w:rPr>
-                <w:b/>
-                <w:bCs/>
-                <w:color w:val="1A1A1A"/>
-              </w:rPr>
-              <w:t>wenn grüne Fahne 🟢 angeklickt wird</w:t>
-            </w:r>
-          </w:p>
-        </w:tc>
-      </w:tr>
-      <w:tr>
-        <w:tblPrEx>
-          <w:tblCellMar>
-            <w:top w:w="0" w:type="dxa"/>
-            <w:bottom w:w="0" w:type="dxa"/>
-          </w:tblCellMar>
-        </w:tblPrEx>
-        <w:tc>
-          <w:tcPr>
-            <w:tcW w:w="10206" w:type="dxa"/>
-            <w:shd w:val="clear" w:color="auto" w:fill="4C97FF"/>
-            <w:tcMar>
-              <w:top w:w="110" w:type="dxa"/>
-              <w:left w:w="260" w:type="dxa"/>
-              <w:bottom w:w="110" w:type="dxa"/>
-              <w:right w:w="200" w:type="dxa"/>
-            </w:tcMar>
-          </w:tcPr>
-          <w:p>
-            <w:r>
-              <w:rPr>
-                <w:b/>
-                <w:bCs/>
-                <w:color w:val="1A1A1A"/>
-              </w:rPr>
-              <w:t>gehe zu x: (⚙️ Start-x) y: (⚙️ Start-y)</w:t>
-            </w:r>
-          </w:p>
-        </w:tc>
-      </w:tr>
-      <w:tr>
-        <w:tblPrEx>
-          <w:tblCellMar>
-            <w:top w:w="0" w:type="dxa"/>
-            <w:bottom w:w="0" w:type="dxa"/>
-          </w:tblCellMar>
-        </w:tblPrEx>
-        <w:tc>
-          <w:tcPr>
-            <w:tcW w:w="10206" w:type="dxa"/>
-            <w:shd w:val="clear" w:color="auto" w:fill="FFAB19"/>
-            <w:tcMar>
-              <w:top w:w="110" w:type="dxa"/>
-              <w:left w:w="260" w:type="dxa"/>
-              <w:bottom w:w="110" w:type="dxa"/>
-              <w:right w:w="200" w:type="dxa"/>
-            </w:tcMar>
-          </w:tcPr>
-          <w:p>
-            <w:r>
-              <w:rPr>
-                <w:b/>
-                <w:bCs/>
-                <w:color w:val="1A1A1A"/>
-              </w:rPr>
-              <w:t>wiederhole fortlaufend</w:t>
-            </w:r>
-          </w:p>
-        </w:tc>
-      </w:tr>
-      <w:tr>
-        <w:tblPrEx>
-          <w:tblCellMar>
-            <w:top w:w="0" w:type="dxa"/>
-            <w:bottom w:w="0" w:type="dxa"/>
-          </w:tblCellMar>
-        </w:tblPrEx>
-        <w:tc>
-          <w:tcPr>
-            <w:tcW w:w="10206" w:type="dxa"/>
-            <w:shd w:val="clear" w:color="auto" w:fill="FFAB19"/>
-            <w:tcMar>
-              <w:top w:w="110" w:type="dxa"/>
-              <w:left w:w="780" w:type="dxa"/>
-              <w:bottom w:w="110" w:type="dxa"/>
-              <w:right w:w="200" w:type="dxa"/>
-            </w:tcMar>
-          </w:tcPr>
-          <w:p>
-            <w:r>
-              <w:rPr>
-                <w:b/>
-                <w:bCs/>
-                <w:color w:val="1A1A1A"/>
-              </w:rPr>
-              <w:t>falls &lt; 🔷 wird Farbe [Ufer-Farbe] berührt? &gt;, dann</w:t>
-            </w:r>
-          </w:p>
-        </w:tc>
-      </w:tr>
-      <w:tr>
-        <w:tblPrEx>
-          <w:tblCellMar>
-            <w:top w:w="0" w:type="dxa"/>
-            <w:bottom w:w="0" w:type="dxa"/>
-          </w:tblCellMar>
-        </w:tblPrEx>
-        <w:tc>
-          <w:tcPr>
-            <w:tcW w:w="10206" w:type="dxa"/>
-            <w:shd w:val="clear" w:color="auto" w:fill="4C97FF"/>
-            <w:tcMar>
-              <w:top w:w="110" w:type="dxa"/>
-              <w:left w:w="1300" w:type="dxa"/>
-              <w:bottom w:w="110" w:type="dxa"/>
-              <w:right w:w="200" w:type="dxa"/>
-            </w:tcMar>
-          </w:tcPr>
-          <w:p>
-            <w:r>
-              <w:rPr>
-                <w:b/>
-                <w:bCs/>
-                <w:color w:val="1A1A1A"/>
-              </w:rPr>
-              <w:t>gehe zu x: (⚙️ Start-x) y: (⚙️ Start-y)</w:t>
-            </w:r>
-          </w:p>
-        </w:tc>
-      </w:tr>
-    </w:tbl>
     <w:p>
       <w:pPr>
         <w:spacing w:after="160"/>
-      </w:pPr>
-    </w:p>
-    <w:tbl>
-      <w:tblPr>
-        <w:tblW w:w="10206" w:type="dxa"/>
-        <w:tblBorders>
-          <w:top w:val="single" w:sz="8" w:space="0" w:color="C0392B"/>
-          <w:left w:val="single" w:sz="8" w:space="0" w:color="C0392B"/>
-          <w:bottom w:val="single" w:sz="8" w:space="0" w:color="C0392B"/>
-          <w:right w:val="single" w:sz="8" w:space="0" w:color="C0392B"/>
-          <w:insideH w:val="none" w:sz="0" w:space="0" w:color="FFFFFF"/>
-          <w:insideV w:val="none" w:sz="0" w:space="0" w:color="FFFFFF"/>
-        </w:tblBorders>
-        <w:tblCellMar>
-          <w:left w:w="10" w:type="dxa"/>
-          <w:right w:w="10" w:type="dxa"/>
-        </w:tblCellMar>
-        <w:tblLook w:val="04A0" w:firstRow="1" w:lastRow="0" w:firstColumn="1" w:lastColumn="0" w:noHBand="0" w:noVBand="1"/>
-      </w:tblPr>
-      <w:tblGrid>
-        <w:gridCol w:w="10206"/>
-      </w:tblGrid>
-      <w:tr>
-        <w:tblPrEx>
-          <w:tblCellMar>
-            <w:top w:w="0" w:type="dxa"/>
-            <w:bottom w:w="0" w:type="dxa"/>
-          </w:tblCellMar>
-        </w:tblPrEx>
-        <w:tc>
-          <w:tcPr>
-            <w:tcW w:w="10206" w:type="dxa"/>
-            <w:shd w:val="clear" w:color="auto" w:fill="FBE0DB"/>
-            <w:tcMar>
-              <w:top w:w="160" w:type="dxa"/>
-              <w:left w:w="220" w:type="dxa"/>
-              <w:bottom w:w="160" w:type="dxa"/>
-              <w:right w:w="220" w:type="dxa"/>
-            </w:tcMar>
-          </w:tcPr>
-          <w:p>
-            <w:r>
-              <w:rPr>
-                <w:b/>
-                <w:bCs/>
-                <w:color w:val="8A1F11"/>
-                <w:sz w:val="26"/>
-                <w:szCs w:val="26"/>
-              </w:rPr>
-              <w:t xml:space="preserve">⚙️ Vor dem Ausdrucken anpassen: </w:t>
-            </w:r>
-            <w:r>
-              <w:rPr>
-                <w:color w:val="1A1A1A"/>
-                <w:sz w:val="26"/>
-                <w:szCs w:val="26"/>
-              </w:rPr>
-              <w:t>Trage hier die tatsächliche Start-Position eures Fischs ein (z. B. x: -200 / y: -150). Wähle beim Vorführen außerdem die richtige Ufer-Farbe mit der Pipette direkt im Projekt aus — die lässt sich hier nicht als Text abbilden.</w:t>
-            </w:r>
-          </w:p>
-        </w:tc>
-      </w:tr>
-    </w:tbl>
+        <w:jc w:val="center"/>
+      </w:pPr>
+      <w:r>
+        <w:drawing>
+          <wp:inline distT="0" distB="0" distL="0" distR="0" wp14:anchorId="227C5D07" wp14:editId="180998AE">
+            <wp:extent cx="3524742" cy="3200847"/>
+            <wp:effectExtent l="0" t="0" r="0" b="0"/>
+            <wp:docPr id="1311746388" name="Grafik 1"/>
+            <wp:cNvGraphicFramePr>
+              <a:graphicFrameLocks xmlns:a="http://schemas.openxmlformats.org/drawingml/2006/main" noChangeAspect="1"/>
+            </wp:cNvGraphicFramePr>
+            <a:graphic xmlns:a="http://schemas.openxmlformats.org/drawingml/2006/main">
+              <a:graphicData uri="http://schemas.openxmlformats.org/drawingml/2006/picture">
+                <pic:pic xmlns:pic="http://schemas.openxmlformats.org/drawingml/2006/picture">
+                  <pic:nvPicPr>
+                    <pic:cNvPr id="1311746388" name=""/>
+                    <pic:cNvPicPr/>
+                  </pic:nvPicPr>
+                  <pic:blipFill>
+                    <a:blip r:embed="rId18"/>
+                    <a:stretch>
+                      <a:fillRect/>
+                    </a:stretch>
+                  </pic:blipFill>
+                  <pic:spPr>
+                    <a:xfrm>
+                      <a:off x="0" y="0"/>
+                      <a:ext cx="3524742" cy="3200847"/>
+                    </a:xfrm>
+                    <a:prstGeom prst="rect">
+                      <a:avLst/>
+                    </a:prstGeom>
+                  </pic:spPr>
+                </pic:pic>
+              </a:graphicData>
+            </a:graphic>
+          </wp:inline>
+        </w:drawing>
+      </w:r>
+    </w:p>
     <w:p>
       <w:pPr>
         <w:spacing w:after="160"/>
@@ -1828,79 +1699,6 @@
         <w:spacing w:after="160"/>
       </w:pPr>
     </w:p>
-    <w:tbl>
-      <w:tblPr>
-        <w:tblW w:w="10206" w:type="dxa"/>
-        <w:tblBorders>
-          <w:top w:val="dashed" w:sz="8" w:space="0" w:color="AAAAAA"/>
-          <w:left w:val="dashed" w:sz="8" w:space="0" w:color="AAAAAA"/>
-          <w:bottom w:val="dashed" w:sz="8" w:space="0" w:color="AAAAAA"/>
-          <w:right w:val="dashed" w:sz="8" w:space="0" w:color="AAAAAA"/>
-          <w:insideH w:val="none" w:sz="0" w:space="0" w:color="FFFFFF"/>
-          <w:insideV w:val="none" w:sz="0" w:space="0" w:color="FFFFFF"/>
-        </w:tblBorders>
-        <w:tblCellMar>
-          <w:left w:w="10" w:type="dxa"/>
-          <w:right w:w="10" w:type="dxa"/>
-        </w:tblCellMar>
-        <w:tblLook w:val="04A0" w:firstRow="1" w:lastRow="0" w:firstColumn="1" w:lastColumn="0" w:noHBand="0" w:noVBand="1"/>
-      </w:tblPr>
-      <w:tblGrid>
-        <w:gridCol w:w="10206"/>
-      </w:tblGrid>
-      <w:tr>
-        <w:tblPrEx>
-          <w:tblCellMar>
-            <w:top w:w="0" w:type="dxa"/>
-            <w:bottom w:w="0" w:type="dxa"/>
-          </w:tblCellMar>
-        </w:tblPrEx>
-        <w:tc>
-          <w:tcPr>
-            <w:tcW w:w="10206" w:type="dxa"/>
-            <w:shd w:val="clear" w:color="auto" w:fill="F4F4F4"/>
-            <w:tcMar>
-              <w:top w:w="160" w:type="dxa"/>
-              <w:left w:w="220" w:type="dxa"/>
-              <w:bottom w:w="160" w:type="dxa"/>
-              <w:right w:w="220" w:type="dxa"/>
-            </w:tcMar>
-          </w:tcPr>
-          <w:p>
-            <w:pPr>
-              <w:spacing w:before="320" w:after="320"/>
-              <w:jc w:val="center"/>
-            </w:pPr>
-            <w:r>
-              <w:rPr>
-                <w:b/>
-                <w:bCs/>
-                <w:color w:val="666666"/>
-                <w:sz w:val="26"/>
-                <w:szCs w:val="26"/>
-              </w:rPr>
-              <w:t>🖼️  Platz für Screenshot</w:t>
-            </w:r>
-          </w:p>
-          <w:p>
-            <w:pPr>
-              <w:spacing w:after="320"/>
-              <w:jc w:val="center"/>
-            </w:pPr>
-            <w:r>
-              <w:rPr>
-                <w:i/>
-                <w:iCs/>
-                <w:color w:val="888888"/>
-                <w:sz w:val="22"/>
-                <w:szCs w:val="22"/>
-              </w:rPr>
-              <w:t>fertiger Skript-Turm dieses Schritts</w:t>
-            </w:r>
-          </w:p>
-        </w:tc>
-      </w:tr>
-    </w:tbl>
     <w:p>
       <w:pPr>
         <w:pageBreakBefore/>
@@ -1973,7 +1771,7 @@
           <w:sz w:val="26"/>
           <w:szCs w:val="26"/>
         </w:rPr>
-        <w:t>Du brauchst keinen neuen Turm: Ergänze einfach deine Dauerschleife aus Schritt C um einen zweiten falls...dann-Block (🟠 Steuerung), direkt unter dem ersten.</w:t>
+        <w:t>Ergänze einfach deine Dauerschleife aus Schritt C um einen zweiten falls...dann-Block (Steuerung), direkt unter dem ersten.</w:t>
       </w:r>
     </w:p>
     <w:p>
@@ -1997,7 +1795,39 @@
           <w:sz w:val="26"/>
           <w:szCs w:val="26"/>
         </w:rPr>
-        <w:t>Zieh den Block „wird [ ] berührt?“ (🔷 Fühlen) in die neue falls-Lücke und wähl im Dropdown deine Abenteuerspielplatz-Figur aus.</w:t>
+        <w:t>Zieh den Block „wird [ ] berührt?“ (Fühlen) in die neue falls-Lücke und wähl</w:t>
+      </w:r>
+      <w:r>
+        <w:rPr>
+          <w:color w:val="1A1A1A"/>
+          <w:sz w:val="26"/>
+          <w:szCs w:val="26"/>
+        </w:rPr>
+        <w:t>e</w:t>
+      </w:r>
+      <w:r>
+        <w:rPr>
+          <w:color w:val="1A1A1A"/>
+          <w:sz w:val="26"/>
+          <w:szCs w:val="26"/>
+        </w:rPr>
+        <w:t xml:space="preserve"> im Dropdown </w:t>
+      </w:r>
+      <w:r>
+        <w:rPr>
+          <w:color w:val="1A1A1A"/>
+          <w:sz w:val="26"/>
+          <w:szCs w:val="26"/>
+        </w:rPr>
+        <w:t xml:space="preserve">den Spielplatz </w:t>
+      </w:r>
+      <w:r>
+        <w:rPr>
+          <w:color w:val="1A1A1A"/>
+          <w:sz w:val="26"/>
+          <w:szCs w:val="26"/>
+        </w:rPr>
+        <w:t>aus.</w:t>
       </w:r>
     </w:p>
     <w:p>
@@ -2021,7 +1851,23 @@
           <w:sz w:val="26"/>
           <w:szCs w:val="26"/>
         </w:rPr>
-        <w:t>Häng in den falls...dann-Block den Block „sage [ ] für ( ) Sekunden“ (🟣 Aussehen) und trag den Text „Geschafft!“ ein.</w:t>
+        <w:t>Häng</w:t>
+      </w:r>
+      <w:r>
+        <w:rPr>
+          <w:color w:val="1A1A1A"/>
+          <w:sz w:val="26"/>
+          <w:szCs w:val="26"/>
+        </w:rPr>
+        <w:t>e</w:t>
+      </w:r>
+      <w:r>
+        <w:rPr>
+          <w:color w:val="1A1A1A"/>
+          <w:sz w:val="26"/>
+          <w:szCs w:val="26"/>
+        </w:rPr>
+        <w:t xml:space="preserve"> in den falls...dann-Block den Block „sage [ ] für ( ) Sekunden“ (Aussehen) und trag den Text „Geschafft!“ ein.</w:t>
       </w:r>
     </w:p>
     <w:p>
@@ -2045,87 +1891,177 @@
           <w:sz w:val="26"/>
           <w:szCs w:val="26"/>
         </w:rPr>
-        <w:t>Häng darunter noch den Block „stoppe [alles]“ (🟠 Steuerung) an.</w:t>
+        <w:t>Häng darunter noch den Block „stoppe [alles]“ (Steuerung) an.</w:t>
       </w:r>
     </w:p>
     <w:p>
       <w:pPr>
         <w:spacing w:after="160"/>
       </w:pPr>
-    </w:p>
-    <w:tbl>
-      <w:tblPr>
-        <w:tblW w:w="10206" w:type="dxa"/>
-        <w:tblBorders>
-          <w:top w:val="dashed" w:sz="8" w:space="0" w:color="AAAAAA"/>
-          <w:left w:val="dashed" w:sz="8" w:space="0" w:color="AAAAAA"/>
-          <w:bottom w:val="dashed" w:sz="8" w:space="0" w:color="AAAAAA"/>
-          <w:right w:val="dashed" w:sz="8" w:space="0" w:color="AAAAAA"/>
-          <w:insideH w:val="none" w:sz="0" w:space="0" w:color="FFFFFF"/>
-          <w:insideV w:val="none" w:sz="0" w:space="0" w:color="FFFFFF"/>
-        </w:tblBorders>
-        <w:tblCellMar>
-          <w:left w:w="10" w:type="dxa"/>
-          <w:right w:w="10" w:type="dxa"/>
-        </w:tblCellMar>
-        <w:tblLook w:val="04A0" w:firstRow="1" w:lastRow="0" w:firstColumn="1" w:lastColumn="0" w:noHBand="0" w:noVBand="1"/>
-      </w:tblPr>
-      <w:tblGrid>
-        <w:gridCol w:w="10206"/>
-      </w:tblGrid>
-      <w:tr>
-        <w:tblPrEx>
-          <w:tblCellMar>
-            <w:top w:w="0" w:type="dxa"/>
-            <w:bottom w:w="0" w:type="dxa"/>
-          </w:tblCellMar>
-        </w:tblPrEx>
-        <w:tc>
-          <w:tcPr>
-            <w:tcW w:w="10206" w:type="dxa"/>
-            <w:shd w:val="clear" w:color="auto" w:fill="F4F4F4"/>
-            <w:tcMar>
-              <w:top w:w="160" w:type="dxa"/>
-              <w:left w:w="220" w:type="dxa"/>
-              <w:bottom w:w="160" w:type="dxa"/>
-              <w:right w:w="220" w:type="dxa"/>
-            </w:tcMar>
-          </w:tcPr>
-          <w:p>
-            <w:pPr>
-              <w:spacing w:before="320" w:after="320"/>
-              <w:jc w:val="center"/>
-            </w:pPr>
-            <w:r>
-              <w:rPr>
-                <w:b/>
-                <w:bCs/>
-                <w:color w:val="666666"/>
-                <w:sz w:val="26"/>
-                <w:szCs w:val="26"/>
-              </w:rPr>
-              <w:t>🖼️  Platz für Screenshot</w:t>
-            </w:r>
-          </w:p>
-          <w:p>
-            <w:pPr>
-              <w:spacing w:after="320"/>
-              <w:jc w:val="center"/>
-            </w:pPr>
-            <w:r>
-              <w:rPr>
-                <w:i/>
-                <w:iCs/>
-                <w:color w:val="888888"/>
-                <w:sz w:val="22"/>
-                <w:szCs w:val="22"/>
-              </w:rPr>
-              <w:t>Dauerschleife mit zwei falls-Blöcken</w:t>
-            </w:r>
-          </w:p>
-        </w:tc>
-      </w:tr>
-    </w:tbl>
+      <w:r>
+        <w:drawing>
+          <wp:inline distT="0" distB="0" distL="0" distR="0" wp14:anchorId="5936C50F" wp14:editId="2532BA1A">
+            <wp:extent cx="1667108" cy="1171739"/>
+            <wp:effectExtent l="0" t="0" r="9525" b="9525"/>
+            <wp:docPr id="782825077" name="Grafik 1"/>
+            <wp:cNvGraphicFramePr>
+              <a:graphicFrameLocks xmlns:a="http://schemas.openxmlformats.org/drawingml/2006/main" noChangeAspect="1"/>
+            </wp:cNvGraphicFramePr>
+            <a:graphic xmlns:a="http://schemas.openxmlformats.org/drawingml/2006/main">
+              <a:graphicData uri="http://schemas.openxmlformats.org/drawingml/2006/picture">
+                <pic:pic xmlns:pic="http://schemas.openxmlformats.org/drawingml/2006/picture">
+                  <pic:nvPicPr>
+                    <pic:cNvPr id="782825077" name=""/>
+                    <pic:cNvPicPr/>
+                  </pic:nvPicPr>
+                  <pic:blipFill>
+                    <a:blip r:embed="rId19"/>
+                    <a:stretch>
+                      <a:fillRect/>
+                    </a:stretch>
+                  </pic:blipFill>
+                  <pic:spPr>
+                    <a:xfrm>
+                      <a:off x="0" y="0"/>
+                      <a:ext cx="1667108" cy="1171739"/>
+                    </a:xfrm>
+                    <a:prstGeom prst="rect">
+                      <a:avLst/>
+                    </a:prstGeom>
+                  </pic:spPr>
+                </pic:pic>
+              </a:graphicData>
+            </a:graphic>
+          </wp:inline>
+        </w:drawing>
+      </w:r>
+    </w:p>
+    <w:p>
+      <w:pPr>
+        <w:spacing w:after="160"/>
+      </w:pPr>
+      <w:r>
+        <w:drawing>
+          <wp:inline distT="0" distB="0" distL="0" distR="0" wp14:anchorId="7DCEF31E" wp14:editId="0751BD7D">
+            <wp:extent cx="2667372" cy="523948"/>
+            <wp:effectExtent l="0" t="0" r="0" b="9525"/>
+            <wp:docPr id="1589023874" name="Grafik 1"/>
+            <wp:cNvGraphicFramePr>
+              <a:graphicFrameLocks xmlns:a="http://schemas.openxmlformats.org/drawingml/2006/main" noChangeAspect="1"/>
+            </wp:cNvGraphicFramePr>
+            <a:graphic xmlns:a="http://schemas.openxmlformats.org/drawingml/2006/main">
+              <a:graphicData uri="http://schemas.openxmlformats.org/drawingml/2006/picture">
+                <pic:pic xmlns:pic="http://schemas.openxmlformats.org/drawingml/2006/picture">
+                  <pic:nvPicPr>
+                    <pic:cNvPr id="1589023874" name=""/>
+                    <pic:cNvPicPr/>
+                  </pic:nvPicPr>
+                  <pic:blipFill>
+                    <a:blip r:embed="rId20"/>
+                    <a:stretch>
+                      <a:fillRect/>
+                    </a:stretch>
+                  </pic:blipFill>
+                  <pic:spPr>
+                    <a:xfrm>
+                      <a:off x="0" y="0"/>
+                      <a:ext cx="2667372" cy="523948"/>
+                    </a:xfrm>
+                    <a:prstGeom prst="rect">
+                      <a:avLst/>
+                    </a:prstGeom>
+                  </pic:spPr>
+                </pic:pic>
+              </a:graphicData>
+            </a:graphic>
+          </wp:inline>
+        </w:drawing>
+      </w:r>
+    </w:p>
+    <w:p>
+      <w:pPr>
+        <w:spacing w:after="160"/>
+      </w:pPr>
+      <w:r>
+        <w:drawing>
+          <wp:inline distT="0" distB="0" distL="0" distR="0" wp14:anchorId="287B0409" wp14:editId="12569248">
+            <wp:extent cx="3172268" cy="628738"/>
+            <wp:effectExtent l="0" t="0" r="0" b="0"/>
+            <wp:docPr id="279831637" name="Grafik 1"/>
+            <wp:cNvGraphicFramePr>
+              <a:graphicFrameLocks xmlns:a="http://schemas.openxmlformats.org/drawingml/2006/main" noChangeAspect="1"/>
+            </wp:cNvGraphicFramePr>
+            <a:graphic xmlns:a="http://schemas.openxmlformats.org/drawingml/2006/main">
+              <a:graphicData uri="http://schemas.openxmlformats.org/drawingml/2006/picture">
+                <pic:pic xmlns:pic="http://schemas.openxmlformats.org/drawingml/2006/picture">
+                  <pic:nvPicPr>
+                    <pic:cNvPr id="279831637" name=""/>
+                    <pic:cNvPicPr/>
+                  </pic:nvPicPr>
+                  <pic:blipFill>
+                    <a:blip r:embed="rId21"/>
+                    <a:stretch>
+                      <a:fillRect/>
+                    </a:stretch>
+                  </pic:blipFill>
+                  <pic:spPr>
+                    <a:xfrm>
+                      <a:off x="0" y="0"/>
+                      <a:ext cx="3172268" cy="628738"/>
+                    </a:xfrm>
+                    <a:prstGeom prst="rect">
+                      <a:avLst/>
+                    </a:prstGeom>
+                  </pic:spPr>
+                </pic:pic>
+              </a:graphicData>
+            </a:graphic>
+          </wp:inline>
+        </w:drawing>
+      </w:r>
+    </w:p>
+    <w:p>
+      <w:pPr>
+        <w:spacing w:after="160"/>
+      </w:pPr>
+      <w:r>
+        <w:drawing>
+          <wp:inline distT="0" distB="0" distL="0" distR="0" wp14:anchorId="642A812F" wp14:editId="4DAAC19D">
+            <wp:extent cx="1467055" cy="600159"/>
+            <wp:effectExtent l="0" t="0" r="0" b="9525"/>
+            <wp:docPr id="1900425885" name="Grafik 1"/>
+            <wp:cNvGraphicFramePr>
+              <a:graphicFrameLocks xmlns:a="http://schemas.openxmlformats.org/drawingml/2006/main" noChangeAspect="1"/>
+            </wp:cNvGraphicFramePr>
+            <a:graphic xmlns:a="http://schemas.openxmlformats.org/drawingml/2006/main">
+              <a:graphicData uri="http://schemas.openxmlformats.org/drawingml/2006/picture">
+                <pic:pic xmlns:pic="http://schemas.openxmlformats.org/drawingml/2006/picture">
+                  <pic:nvPicPr>
+                    <pic:cNvPr id="1900425885" name=""/>
+                    <pic:cNvPicPr/>
+                  </pic:nvPicPr>
+                  <pic:blipFill>
+                    <a:blip r:embed="rId22"/>
+                    <a:stretch>
+                      <a:fillRect/>
+                    </a:stretch>
+                  </pic:blipFill>
+                  <pic:spPr>
+                    <a:xfrm>
+                      <a:off x="0" y="0"/>
+                      <a:ext cx="1467055" cy="600159"/>
+                    </a:xfrm>
+                    <a:prstGeom prst="rect">
+                      <a:avLst/>
+                    </a:prstGeom>
+                  </pic:spPr>
+                </pic:pic>
+              </a:graphicData>
+            </a:graphic>
+          </wp:inline>
+        </w:drawing>
+      </w:r>
+    </w:p>
     <w:p>
       <w:pPr>
         <w:pageBreakBefore/>
@@ -2160,271 +2096,48 @@
         <w:t>Zweiter Block, direkt unter dem Ufer-Check in derselben Dauerschleife:</w:t>
       </w:r>
     </w:p>
-    <w:tbl>
-      <w:tblPr>
-        <w:tblW w:w="10206" w:type="dxa"/>
-        <w:tblBorders>
-          <w:top w:val="single" w:sz="8" w:space="0" w:color="333333"/>
-          <w:left w:val="single" w:sz="8" w:space="0" w:color="333333"/>
-          <w:bottom w:val="single" w:sz="8" w:space="0" w:color="333333"/>
-          <w:right w:val="single" w:sz="8" w:space="0" w:color="333333"/>
-          <w:insideH w:val="single" w:sz="2" w:space="0" w:color="FFFFFF"/>
-          <w:insideV w:val="none" w:sz="0" w:space="0" w:color="FFFFFF"/>
-        </w:tblBorders>
-        <w:tblCellMar>
-          <w:left w:w="10" w:type="dxa"/>
-          <w:right w:w="10" w:type="dxa"/>
-        </w:tblCellMar>
-        <w:tblLook w:val="04A0" w:firstRow="1" w:lastRow="0" w:firstColumn="1" w:lastColumn="0" w:noHBand="0" w:noVBand="1"/>
-      </w:tblPr>
-      <w:tblGrid>
-        <w:gridCol w:w="10206"/>
-      </w:tblGrid>
-      <w:tr>
-        <w:tblPrEx>
-          <w:tblCellMar>
-            <w:top w:w="0" w:type="dxa"/>
-            <w:bottom w:w="0" w:type="dxa"/>
-          </w:tblCellMar>
-        </w:tblPrEx>
-        <w:tc>
-          <w:tcPr>
-            <w:tcW w:w="10206" w:type="dxa"/>
-            <w:shd w:val="clear" w:color="auto" w:fill="FFBF00"/>
-            <w:tcMar>
-              <w:top w:w="110" w:type="dxa"/>
-              <w:left w:w="260" w:type="dxa"/>
-              <w:bottom w:w="110" w:type="dxa"/>
-              <w:right w:w="200" w:type="dxa"/>
-            </w:tcMar>
-          </w:tcPr>
-          <w:p>
-            <w:r>
-              <w:rPr>
-                <w:b/>
-                <w:bCs/>
-                <w:color w:val="1A1A1A"/>
-              </w:rPr>
-              <w:t>wenn grüne Fahne 🟢 angeklickt wird</w:t>
-            </w:r>
-          </w:p>
-        </w:tc>
-      </w:tr>
-      <w:tr>
-        <w:tblPrEx>
-          <w:tblCellMar>
-            <w:top w:w="0" w:type="dxa"/>
-            <w:bottom w:w="0" w:type="dxa"/>
-          </w:tblCellMar>
-        </w:tblPrEx>
-        <w:tc>
-          <w:tcPr>
-            <w:tcW w:w="10206" w:type="dxa"/>
-            <w:shd w:val="clear" w:color="auto" w:fill="4C97FF"/>
-            <w:tcMar>
-              <w:top w:w="110" w:type="dxa"/>
-              <w:left w:w="260" w:type="dxa"/>
-              <w:bottom w:w="110" w:type="dxa"/>
-              <w:right w:w="200" w:type="dxa"/>
-            </w:tcMar>
-          </w:tcPr>
-          <w:p>
-            <w:r>
-              <w:rPr>
-                <w:b/>
-                <w:bCs/>
-                <w:color w:val="1A1A1A"/>
-              </w:rPr>
-              <w:t>gehe zu x: (⚙️ Start-x) y: (⚙️ Start-y)</w:t>
-            </w:r>
-          </w:p>
-        </w:tc>
-      </w:tr>
-      <w:tr>
-        <w:tblPrEx>
-          <w:tblCellMar>
-            <w:top w:w="0" w:type="dxa"/>
-            <w:bottom w:w="0" w:type="dxa"/>
-          </w:tblCellMar>
-        </w:tblPrEx>
-        <w:tc>
-          <w:tcPr>
-            <w:tcW w:w="10206" w:type="dxa"/>
-            <w:shd w:val="clear" w:color="auto" w:fill="FFAB19"/>
-            <w:tcMar>
-              <w:top w:w="110" w:type="dxa"/>
-              <w:left w:w="260" w:type="dxa"/>
-              <w:bottom w:w="110" w:type="dxa"/>
-              <w:right w:w="200" w:type="dxa"/>
-            </w:tcMar>
-          </w:tcPr>
-          <w:p>
-            <w:r>
-              <w:rPr>
-                <w:b/>
-                <w:bCs/>
-                <w:color w:val="1A1A1A"/>
-              </w:rPr>
-              <w:t>wiederhole fortlaufend</w:t>
-            </w:r>
-          </w:p>
-        </w:tc>
-      </w:tr>
-      <w:tr>
-        <w:tblPrEx>
-          <w:tblCellMar>
-            <w:top w:w="0" w:type="dxa"/>
-            <w:bottom w:w="0" w:type="dxa"/>
-          </w:tblCellMar>
-        </w:tblPrEx>
-        <w:tc>
-          <w:tcPr>
-            <w:tcW w:w="10206" w:type="dxa"/>
-            <w:shd w:val="clear" w:color="auto" w:fill="FFAB19"/>
-            <w:tcMar>
-              <w:top w:w="110" w:type="dxa"/>
-              <w:left w:w="780" w:type="dxa"/>
-              <w:bottom w:w="110" w:type="dxa"/>
-              <w:right w:w="200" w:type="dxa"/>
-            </w:tcMar>
-          </w:tcPr>
-          <w:p>
-            <w:r>
-              <w:rPr>
-                <w:b/>
-                <w:bCs/>
-                <w:color w:val="1A1A1A"/>
-              </w:rPr>
-              <w:t>falls &lt; 🔷 wird Farbe [Ufer-Farbe] berührt? &gt;, dann</w:t>
-            </w:r>
-          </w:p>
-        </w:tc>
-      </w:tr>
-      <w:tr>
-        <w:tblPrEx>
-          <w:tblCellMar>
-            <w:top w:w="0" w:type="dxa"/>
-            <w:bottom w:w="0" w:type="dxa"/>
-          </w:tblCellMar>
-        </w:tblPrEx>
-        <w:tc>
-          <w:tcPr>
-            <w:tcW w:w="10206" w:type="dxa"/>
-            <w:shd w:val="clear" w:color="auto" w:fill="4C97FF"/>
-            <w:tcMar>
-              <w:top w:w="110" w:type="dxa"/>
-              <w:left w:w="1300" w:type="dxa"/>
-              <w:bottom w:w="110" w:type="dxa"/>
-              <w:right w:w="200" w:type="dxa"/>
-            </w:tcMar>
-          </w:tcPr>
-          <w:p>
-            <w:r>
-              <w:rPr>
-                <w:b/>
-                <w:bCs/>
-                <w:color w:val="1A1A1A"/>
-              </w:rPr>
-              <w:t>gehe zu x: (⚙️ Start-x) y: (⚙️ Start-y)</w:t>
-            </w:r>
-          </w:p>
-        </w:tc>
-      </w:tr>
-      <w:tr>
-        <w:tblPrEx>
-          <w:tblCellMar>
-            <w:top w:w="0" w:type="dxa"/>
-            <w:bottom w:w="0" w:type="dxa"/>
-          </w:tblCellMar>
-        </w:tblPrEx>
-        <w:tc>
-          <w:tcPr>
-            <w:tcW w:w="10206" w:type="dxa"/>
-            <w:shd w:val="clear" w:color="auto" w:fill="FFAB19"/>
-            <w:tcMar>
-              <w:top w:w="110" w:type="dxa"/>
-              <w:left w:w="780" w:type="dxa"/>
-              <w:bottom w:w="110" w:type="dxa"/>
-              <w:right w:w="200" w:type="dxa"/>
-            </w:tcMar>
-          </w:tcPr>
-          <w:p>
-            <w:r>
-              <w:rPr>
-                <w:b/>
-                <w:bCs/>
-                <w:color w:val="1A1A1A"/>
-              </w:rPr>
-              <w:t>falls &lt; 🔷 wird [Abenteuerspielplatz] berührt? &gt;, dann</w:t>
-            </w:r>
-          </w:p>
-        </w:tc>
-      </w:tr>
-      <w:tr>
-        <w:tblPrEx>
-          <w:tblCellMar>
-            <w:top w:w="0" w:type="dxa"/>
-            <w:bottom w:w="0" w:type="dxa"/>
-          </w:tblCellMar>
-        </w:tblPrEx>
-        <w:tc>
-          <w:tcPr>
-            <w:tcW w:w="10206" w:type="dxa"/>
-            <w:shd w:val="clear" w:color="auto" w:fill="9966FF"/>
-            <w:tcMar>
-              <w:top w:w="110" w:type="dxa"/>
-              <w:left w:w="1300" w:type="dxa"/>
-              <w:bottom w:w="110" w:type="dxa"/>
-              <w:right w:w="200" w:type="dxa"/>
-            </w:tcMar>
-          </w:tcPr>
-          <w:p>
-            <w:r>
-              <w:rPr>
-                <w:b/>
-                <w:bCs/>
-                <w:color w:val="1A1A1A"/>
-              </w:rPr>
-              <w:t>sage [Geschafft! 🎉] für (2) Sekunden</w:t>
-            </w:r>
-          </w:p>
-        </w:tc>
-      </w:tr>
-      <w:tr>
-        <w:tblPrEx>
-          <w:tblCellMar>
-            <w:top w:w="0" w:type="dxa"/>
-            <w:bottom w:w="0" w:type="dxa"/>
-          </w:tblCellMar>
-        </w:tblPrEx>
-        <w:tc>
-          <w:tcPr>
-            <w:tcW w:w="10206" w:type="dxa"/>
-            <w:shd w:val="clear" w:color="auto" w:fill="FFAB19"/>
-            <w:tcMar>
-              <w:top w:w="110" w:type="dxa"/>
-              <w:left w:w="1300" w:type="dxa"/>
-              <w:bottom w:w="110" w:type="dxa"/>
-              <w:right w:w="200" w:type="dxa"/>
-            </w:tcMar>
-          </w:tcPr>
-          <w:p>
-            <w:r>
-              <w:rPr>
-                <w:b/>
-                <w:bCs/>
-                <w:color w:val="1A1A1A"/>
-              </w:rPr>
-              <w:t>stoppe [alles]</w:t>
-            </w:r>
-          </w:p>
-        </w:tc>
-      </w:tr>
-    </w:tbl>
     <w:p>
       <w:pPr>
         <w:spacing w:after="160"/>
-      </w:pPr>
+        <w:jc w:val="center"/>
+      </w:pPr>
+      <w:r>
+        <w:drawing>
+          <wp:inline distT="0" distB="0" distL="0" distR="0" wp14:anchorId="22C65110" wp14:editId="2D20A396">
+            <wp:extent cx="3972479" cy="4991797"/>
+            <wp:effectExtent l="0" t="0" r="9525" b="0"/>
+            <wp:docPr id="172647989" name="Grafik 1"/>
+            <wp:cNvGraphicFramePr>
+              <a:graphicFrameLocks xmlns:a="http://schemas.openxmlformats.org/drawingml/2006/main" noChangeAspect="1"/>
+            </wp:cNvGraphicFramePr>
+            <a:graphic xmlns:a="http://schemas.openxmlformats.org/drawingml/2006/main">
+              <a:graphicData uri="http://schemas.openxmlformats.org/drawingml/2006/picture">
+                <pic:pic xmlns:pic="http://schemas.openxmlformats.org/drawingml/2006/picture">
+                  <pic:nvPicPr>
+                    <pic:cNvPr id="172647989" name=""/>
+                    <pic:cNvPicPr/>
+                  </pic:nvPicPr>
+                  <pic:blipFill>
+                    <a:blip r:embed="rId23"/>
+                    <a:stretch>
+                      <a:fillRect/>
+                    </a:stretch>
+                  </pic:blipFill>
+                  <pic:spPr>
+                    <a:xfrm>
+                      <a:off x="0" y="0"/>
+                      <a:ext cx="3972479" cy="4991797"/>
+                    </a:xfrm>
+                    <a:prstGeom prst="rect">
+                      <a:avLst/>
+                    </a:prstGeom>
+                  </pic:spPr>
+                </pic:pic>
+              </a:graphicData>
+            </a:graphic>
+          </wp:inline>
+        </w:drawing>
+      </w:r>
     </w:p>
     <w:p>
       <w:pPr>
@@ -2444,79 +2157,6 @@
         <w:spacing w:after="160"/>
       </w:pPr>
     </w:p>
-    <w:tbl>
-      <w:tblPr>
-        <w:tblW w:w="10206" w:type="dxa"/>
-        <w:tblBorders>
-          <w:top w:val="dashed" w:sz="8" w:space="0" w:color="AAAAAA"/>
-          <w:left w:val="dashed" w:sz="8" w:space="0" w:color="AAAAAA"/>
-          <w:bottom w:val="dashed" w:sz="8" w:space="0" w:color="AAAAAA"/>
-          <w:right w:val="dashed" w:sz="8" w:space="0" w:color="AAAAAA"/>
-          <w:insideH w:val="none" w:sz="0" w:space="0" w:color="FFFFFF"/>
-          <w:insideV w:val="none" w:sz="0" w:space="0" w:color="FFFFFF"/>
-        </w:tblBorders>
-        <w:tblCellMar>
-          <w:left w:w="10" w:type="dxa"/>
-          <w:right w:w="10" w:type="dxa"/>
-        </w:tblCellMar>
-        <w:tblLook w:val="04A0" w:firstRow="1" w:lastRow="0" w:firstColumn="1" w:lastColumn="0" w:noHBand="0" w:noVBand="1"/>
-      </w:tblPr>
-      <w:tblGrid>
-        <w:gridCol w:w="10206"/>
-      </w:tblGrid>
-      <w:tr>
-        <w:tblPrEx>
-          <w:tblCellMar>
-            <w:top w:w="0" w:type="dxa"/>
-            <w:bottom w:w="0" w:type="dxa"/>
-          </w:tblCellMar>
-        </w:tblPrEx>
-        <w:tc>
-          <w:tcPr>
-            <w:tcW w:w="10206" w:type="dxa"/>
-            <w:shd w:val="clear" w:color="auto" w:fill="F4F4F4"/>
-            <w:tcMar>
-              <w:top w:w="160" w:type="dxa"/>
-              <w:left w:w="220" w:type="dxa"/>
-              <w:bottom w:w="160" w:type="dxa"/>
-              <w:right w:w="220" w:type="dxa"/>
-            </w:tcMar>
-          </w:tcPr>
-          <w:p>
-            <w:pPr>
-              <w:spacing w:before="320" w:after="320"/>
-              <w:jc w:val="center"/>
-            </w:pPr>
-            <w:r>
-              <w:rPr>
-                <w:b/>
-                <w:bCs/>
-                <w:color w:val="666666"/>
-                <w:sz w:val="26"/>
-                <w:szCs w:val="26"/>
-              </w:rPr>
-              <w:t>🖼️  Platz für Screenshot</w:t>
-            </w:r>
-          </w:p>
-          <w:p>
-            <w:pPr>
-              <w:spacing w:after="320"/>
-              <w:jc w:val="center"/>
-            </w:pPr>
-            <w:r>
-              <w:rPr>
-                <w:i/>
-                <w:iCs/>
-                <w:color w:val="888888"/>
-                <w:sz w:val="22"/>
-                <w:szCs w:val="22"/>
-              </w:rPr>
-              <w:t>komplettes Skript inkl. Ziel-Check</w:t>
-            </w:r>
-          </w:p>
-        </w:tc>
-      </w:tr>
-    </w:tbl>
     <w:p>
       <w:pPr>
         <w:pageBreakBefore/>
@@ -2578,7 +2218,7 @@
                     </pic:cNvPicPr>
                   </pic:nvPicPr>
                   <pic:blipFill>
-                    <a:blip r:embed="rId17"/>
+                    <a:blip r:embed="rId24"/>
                     <a:srcRect/>
                     <a:stretch>
                       <a:fillRect/>
@@ -2649,7 +2289,25 @@
           <w:sz w:val="26"/>
           <w:szCs w:val="26"/>
         </w:rPr>
-        <w:t>Den Block „wenn grüne Fahne 🟢 angeklickt wird“ (🟡 Ereignisse).</w:t>
+        <w:t xml:space="preserve">Den Block </w:t>
+      </w:r>
+      <w:proofErr w:type="gramStart"/>
+      <w:r>
+        <w:rPr>
+          <w:color w:val="1A1A1A"/>
+          <w:sz w:val="26"/>
+          <w:szCs w:val="26"/>
+        </w:rPr>
+        <w:t>„</w:t>
+      </w:r>
+      <w:proofErr w:type="gramEnd"/>
+      <w:r>
+        <w:rPr>
+          <w:color w:val="1A1A1A"/>
+          <w:sz w:val="26"/>
+          <w:szCs w:val="26"/>
+        </w:rPr>
+        <w:t>wenn grüne Fahne angeklickt wird“ (Ereignisse).</w:t>
       </w:r>
     </w:p>
     <w:p>
@@ -2673,7 +2331,7 @@
           <w:sz w:val="26"/>
           <w:szCs w:val="26"/>
         </w:rPr>
-        <w:t>Darunter den Block „wiederhole fortlaufend“ (🟠 Steuerung).</w:t>
+        <w:t>Darunter den Block „wiederhole fortlaufend“ (Steuerung).</w:t>
       </w:r>
     </w:p>
     <w:p>
@@ -2697,7 +2355,41 @@
           <w:sz w:val="26"/>
           <w:szCs w:val="26"/>
         </w:rPr>
-        <w:t>Darin die Blöcke „gehe ( ) Schritte“ und „pralle vom Rand ab“ (beide 🔵 Bewegung).</w:t>
+        <w:t xml:space="preserve">Darin die Blöcke „gehe </w:t>
+      </w:r>
+      <w:proofErr w:type="gramStart"/>
+      <w:r>
+        <w:rPr>
+          <w:color w:val="1A1A1A"/>
+          <w:sz w:val="26"/>
+          <w:szCs w:val="26"/>
+        </w:rPr>
+        <w:t>( )</w:t>
+      </w:r>
+      <w:proofErr w:type="gramEnd"/>
+      <w:r>
+        <w:rPr>
+          <w:color w:val="1A1A1A"/>
+          <w:sz w:val="26"/>
+          <w:szCs w:val="26"/>
+        </w:rPr>
+        <w:t xml:space="preserve"> Schritte“ und „pralle vom Rand ab“ (beide</w:t>
+      </w:r>
+      <w:r>
+        <w:rPr>
+          <w:color w:val="1A1A1A"/>
+          <w:sz w:val="26"/>
+          <w:szCs w:val="26"/>
+        </w:rPr>
+        <w:t xml:space="preserve"> </w:t>
+      </w:r>
+      <w:r>
+        <w:rPr>
+          <w:color w:val="1A1A1A"/>
+          <w:sz w:val="26"/>
+          <w:szCs w:val="26"/>
+        </w:rPr>
+        <w:t>Bewegung).</w:t>
       </w:r>
     </w:p>
     <w:p>
@@ -2733,79 +2425,6 @@
         <w:spacing w:after="160"/>
       </w:pPr>
     </w:p>
-    <w:tbl>
-      <w:tblPr>
-        <w:tblW w:w="10206" w:type="dxa"/>
-        <w:tblBorders>
-          <w:top w:val="dashed" w:sz="8" w:space="0" w:color="AAAAAA"/>
-          <w:left w:val="dashed" w:sz="8" w:space="0" w:color="AAAAAA"/>
-          <w:bottom w:val="dashed" w:sz="8" w:space="0" w:color="AAAAAA"/>
-          <w:right w:val="dashed" w:sz="8" w:space="0" w:color="AAAAAA"/>
-          <w:insideH w:val="none" w:sz="0" w:space="0" w:color="FFFFFF"/>
-          <w:insideV w:val="none" w:sz="0" w:space="0" w:color="FFFFFF"/>
-        </w:tblBorders>
-        <w:tblCellMar>
-          <w:left w:w="10" w:type="dxa"/>
-          <w:right w:w="10" w:type="dxa"/>
-        </w:tblCellMar>
-        <w:tblLook w:val="04A0" w:firstRow="1" w:lastRow="0" w:firstColumn="1" w:lastColumn="0" w:noHBand="0" w:noVBand="1"/>
-      </w:tblPr>
-      <w:tblGrid>
-        <w:gridCol w:w="10206"/>
-      </w:tblGrid>
-      <w:tr>
-        <w:tblPrEx>
-          <w:tblCellMar>
-            <w:top w:w="0" w:type="dxa"/>
-            <w:bottom w:w="0" w:type="dxa"/>
-          </w:tblCellMar>
-        </w:tblPrEx>
-        <w:tc>
-          <w:tcPr>
-            <w:tcW w:w="10206" w:type="dxa"/>
-            <w:shd w:val="clear" w:color="auto" w:fill="F4F4F4"/>
-            <w:tcMar>
-              <w:top w:w="160" w:type="dxa"/>
-              <w:left w:w="220" w:type="dxa"/>
-              <w:bottom w:w="160" w:type="dxa"/>
-              <w:right w:w="220" w:type="dxa"/>
-            </w:tcMar>
-          </w:tcPr>
-          <w:p>
-            <w:pPr>
-              <w:spacing w:before="320" w:after="320"/>
-              <w:jc w:val="center"/>
-            </w:pPr>
-            <w:r>
-              <w:rPr>
-                <w:b/>
-                <w:bCs/>
-                <w:color w:val="666666"/>
-                <w:sz w:val="26"/>
-                <w:szCs w:val="26"/>
-              </w:rPr>
-              <w:t>🖼️  Platz für Screenshot</w:t>
-            </w:r>
-          </w:p>
-          <w:p>
-            <w:pPr>
-              <w:spacing w:after="320"/>
-              <w:jc w:val="center"/>
-            </w:pPr>
-            <w:r>
-              <w:rPr>
-                <w:i/>
-                <w:iCs/>
-                <w:color w:val="888888"/>
-                <w:sz w:val="22"/>
-                <w:szCs w:val="22"/>
-              </w:rPr>
-              <w:t>Angel-Figur mit eigenem Bewegungsskript</w:t>
-            </w:r>
-          </w:p>
-        </w:tc>
-      </w:tr>
-    </w:tbl>
     <w:p>
       <w:pPr>
         <w:pageBreakBefore/>
@@ -2840,151 +2459,48 @@
         <w:t>Skript auf der Angel-Figur:</w:t>
       </w:r>
     </w:p>
-    <w:tbl>
-      <w:tblPr>
-        <w:tblW w:w="10206" w:type="dxa"/>
-        <w:tblBorders>
-          <w:top w:val="single" w:sz="8" w:space="0" w:color="333333"/>
-          <w:left w:val="single" w:sz="8" w:space="0" w:color="333333"/>
-          <w:bottom w:val="single" w:sz="8" w:space="0" w:color="333333"/>
-          <w:right w:val="single" w:sz="8" w:space="0" w:color="333333"/>
-          <w:insideH w:val="single" w:sz="2" w:space="0" w:color="FFFFFF"/>
-          <w:insideV w:val="none" w:sz="0" w:space="0" w:color="FFFFFF"/>
-        </w:tblBorders>
-        <w:tblCellMar>
-          <w:left w:w="10" w:type="dxa"/>
-          <w:right w:w="10" w:type="dxa"/>
-        </w:tblCellMar>
-        <w:tblLook w:val="04A0" w:firstRow="1" w:lastRow="0" w:firstColumn="1" w:lastColumn="0" w:noHBand="0" w:noVBand="1"/>
-      </w:tblPr>
-      <w:tblGrid>
-        <w:gridCol w:w="10206"/>
-      </w:tblGrid>
-      <w:tr>
-        <w:tblPrEx>
-          <w:tblCellMar>
-            <w:top w:w="0" w:type="dxa"/>
-            <w:bottom w:w="0" w:type="dxa"/>
-          </w:tblCellMar>
-        </w:tblPrEx>
-        <w:tc>
-          <w:tcPr>
-            <w:tcW w:w="10206" w:type="dxa"/>
-            <w:shd w:val="clear" w:color="auto" w:fill="FFBF00"/>
-            <w:tcMar>
-              <w:top w:w="110" w:type="dxa"/>
-              <w:left w:w="260" w:type="dxa"/>
-              <w:bottom w:w="110" w:type="dxa"/>
-              <w:right w:w="200" w:type="dxa"/>
-            </w:tcMar>
-          </w:tcPr>
-          <w:p>
-            <w:r>
-              <w:rPr>
-                <w:b/>
-                <w:bCs/>
-                <w:color w:val="1A1A1A"/>
-              </w:rPr>
-              <w:t>wenn grüne Fahne 🟢 angeklickt wird</w:t>
-            </w:r>
-          </w:p>
-        </w:tc>
-      </w:tr>
-      <w:tr>
-        <w:tblPrEx>
-          <w:tblCellMar>
-            <w:top w:w="0" w:type="dxa"/>
-            <w:bottom w:w="0" w:type="dxa"/>
-          </w:tblCellMar>
-        </w:tblPrEx>
-        <w:tc>
-          <w:tcPr>
-            <w:tcW w:w="10206" w:type="dxa"/>
-            <w:shd w:val="clear" w:color="auto" w:fill="FFAB19"/>
-            <w:tcMar>
-              <w:top w:w="110" w:type="dxa"/>
-              <w:left w:w="260" w:type="dxa"/>
-              <w:bottom w:w="110" w:type="dxa"/>
-              <w:right w:w="200" w:type="dxa"/>
-            </w:tcMar>
-          </w:tcPr>
-          <w:p>
-            <w:r>
-              <w:rPr>
-                <w:b/>
-                <w:bCs/>
-                <w:color w:val="1A1A1A"/>
-              </w:rPr>
-              <w:t>wiederhole fortlaufend</w:t>
-            </w:r>
-          </w:p>
-        </w:tc>
-      </w:tr>
-      <w:tr>
-        <w:tblPrEx>
-          <w:tblCellMar>
-            <w:top w:w="0" w:type="dxa"/>
-            <w:bottom w:w="0" w:type="dxa"/>
-          </w:tblCellMar>
-        </w:tblPrEx>
-        <w:tc>
-          <w:tcPr>
-            <w:tcW w:w="10206" w:type="dxa"/>
-            <w:shd w:val="clear" w:color="auto" w:fill="4C97FF"/>
-            <w:tcMar>
-              <w:top w:w="110" w:type="dxa"/>
-              <w:left w:w="780" w:type="dxa"/>
-              <w:bottom w:w="110" w:type="dxa"/>
-              <w:right w:w="200" w:type="dxa"/>
-            </w:tcMar>
-          </w:tcPr>
-          <w:p>
-            <w:r>
-              <w:rPr>
-                <w:b/>
-                <w:bCs/>
-                <w:color w:val="1A1A1A"/>
-              </w:rPr>
-              <w:t>gehe (5) Schritte</w:t>
-            </w:r>
-          </w:p>
-        </w:tc>
-      </w:tr>
-      <w:tr>
-        <w:tblPrEx>
-          <w:tblCellMar>
-            <w:top w:w="0" w:type="dxa"/>
-            <w:bottom w:w="0" w:type="dxa"/>
-          </w:tblCellMar>
-        </w:tblPrEx>
-        <w:tc>
-          <w:tcPr>
-            <w:tcW w:w="10206" w:type="dxa"/>
-            <w:shd w:val="clear" w:color="auto" w:fill="4C97FF"/>
-            <w:tcMar>
-              <w:top w:w="110" w:type="dxa"/>
-              <w:left w:w="780" w:type="dxa"/>
-              <w:bottom w:w="110" w:type="dxa"/>
-              <w:right w:w="200" w:type="dxa"/>
-            </w:tcMar>
-          </w:tcPr>
-          <w:p>
-            <w:r>
-              <w:rPr>
-                <w:b/>
-                <w:bCs/>
-                <w:color w:val="1A1A1A"/>
-              </w:rPr>
-              <w:t>pralle vom Rand ab</w:t>
-            </w:r>
-          </w:p>
-        </w:tc>
-      </w:tr>
-    </w:tbl>
     <w:p>
       <w:pPr>
         <w:spacing w:after="160"/>
-      </w:pPr>
+        <w:jc w:val="center"/>
+      </w:pPr>
+      <w:r>
+        <w:drawing>
+          <wp:inline distT="0" distB="0" distL="0" distR="0" wp14:anchorId="6B4A4D13" wp14:editId="1C7BBD21">
+            <wp:extent cx="2105319" cy="2467319"/>
+            <wp:effectExtent l="0" t="0" r="9525" b="0"/>
+            <wp:docPr id="889593881" name="Grafik 1"/>
+            <wp:cNvGraphicFramePr>
+              <a:graphicFrameLocks xmlns:a="http://schemas.openxmlformats.org/drawingml/2006/main" noChangeAspect="1"/>
+            </wp:cNvGraphicFramePr>
+            <a:graphic xmlns:a="http://schemas.openxmlformats.org/drawingml/2006/main">
+              <a:graphicData uri="http://schemas.openxmlformats.org/drawingml/2006/picture">
+                <pic:pic xmlns:pic="http://schemas.openxmlformats.org/drawingml/2006/picture">
+                  <pic:nvPicPr>
+                    <pic:cNvPr id="889593881" name=""/>
+                    <pic:cNvPicPr/>
+                  </pic:nvPicPr>
+                  <pic:blipFill>
+                    <a:blip r:embed="rId25"/>
+                    <a:stretch>
+                      <a:fillRect/>
+                    </a:stretch>
+                  </pic:blipFill>
+                  <pic:spPr>
+                    <a:xfrm>
+                      <a:off x="0" y="0"/>
+                      <a:ext cx="2105319" cy="2467319"/>
+                    </a:xfrm>
+                    <a:prstGeom prst="rect">
+                      <a:avLst/>
+                    </a:prstGeom>
+                  </pic:spPr>
+                </pic:pic>
+              </a:graphicData>
+            </a:graphic>
+          </wp:inline>
+        </w:drawing>
+      </w:r>
     </w:p>
     <w:p>
       <w:pPr>
@@ -2999,91 +2515,48 @@
         <w:t>Dritter falls...dann auf der Fisch-Figur, in der bekannten Dauerschleife:</w:t>
       </w:r>
     </w:p>
-    <w:tbl>
-      <w:tblPr>
-        <w:tblW w:w="10206" w:type="dxa"/>
-        <w:tblBorders>
-          <w:top w:val="single" w:sz="8" w:space="0" w:color="333333"/>
-          <w:left w:val="single" w:sz="8" w:space="0" w:color="333333"/>
-          <w:bottom w:val="single" w:sz="8" w:space="0" w:color="333333"/>
-          <w:right w:val="single" w:sz="8" w:space="0" w:color="333333"/>
-          <w:insideH w:val="single" w:sz="2" w:space="0" w:color="FFFFFF"/>
-          <w:insideV w:val="none" w:sz="0" w:space="0" w:color="FFFFFF"/>
-        </w:tblBorders>
-        <w:tblCellMar>
-          <w:left w:w="10" w:type="dxa"/>
-          <w:right w:w="10" w:type="dxa"/>
-        </w:tblCellMar>
-        <w:tblLook w:val="04A0" w:firstRow="1" w:lastRow="0" w:firstColumn="1" w:lastColumn="0" w:noHBand="0" w:noVBand="1"/>
-      </w:tblPr>
-      <w:tblGrid>
-        <w:gridCol w:w="10206"/>
-      </w:tblGrid>
-      <w:tr>
-        <w:tblPrEx>
-          <w:tblCellMar>
-            <w:top w:w="0" w:type="dxa"/>
-            <w:bottom w:w="0" w:type="dxa"/>
-          </w:tblCellMar>
-        </w:tblPrEx>
-        <w:tc>
-          <w:tcPr>
-            <w:tcW w:w="10206" w:type="dxa"/>
-            <w:shd w:val="clear" w:color="auto" w:fill="FFAB19"/>
-            <w:tcMar>
-              <w:top w:w="110" w:type="dxa"/>
-              <w:left w:w="780" w:type="dxa"/>
-              <w:bottom w:w="110" w:type="dxa"/>
-              <w:right w:w="200" w:type="dxa"/>
-            </w:tcMar>
-          </w:tcPr>
-          <w:p>
-            <w:r>
-              <w:rPr>
-                <w:b/>
-                <w:bCs/>
-                <w:color w:val="1A1A1A"/>
-              </w:rPr>
-              <w:t>falls &lt; 🔷 wird [Angel] berührt? &gt;, dann</w:t>
-            </w:r>
-          </w:p>
-        </w:tc>
-      </w:tr>
-      <w:tr>
-        <w:tblPrEx>
-          <w:tblCellMar>
-            <w:top w:w="0" w:type="dxa"/>
-            <w:bottom w:w="0" w:type="dxa"/>
-          </w:tblCellMar>
-        </w:tblPrEx>
-        <w:tc>
-          <w:tcPr>
-            <w:tcW w:w="10206" w:type="dxa"/>
-            <w:shd w:val="clear" w:color="auto" w:fill="4C97FF"/>
-            <w:tcMar>
-              <w:top w:w="110" w:type="dxa"/>
-              <w:left w:w="1300" w:type="dxa"/>
-              <w:bottom w:w="110" w:type="dxa"/>
-              <w:right w:w="200" w:type="dxa"/>
-            </w:tcMar>
-          </w:tcPr>
-          <w:p>
-            <w:r>
-              <w:rPr>
-                <w:b/>
-                <w:bCs/>
-                <w:color w:val="1A1A1A"/>
-              </w:rPr>
-              <w:t>gehe zu x: (⚙️ Start-x) y: (⚙️ Start-y)</w:t>
-            </w:r>
-          </w:p>
-        </w:tc>
-      </w:tr>
-    </w:tbl>
     <w:p>
       <w:pPr>
         <w:spacing w:after="160"/>
-      </w:pPr>
+        <w:jc w:val="center"/>
+      </w:pPr>
+      <w:r>
+        <w:drawing>
+          <wp:inline distT="0" distB="0" distL="0" distR="0" wp14:anchorId="309A3DFA" wp14:editId="55C0716C">
+            <wp:extent cx="3068186" cy="4831080"/>
+            <wp:effectExtent l="0" t="0" r="0" b="7620"/>
+            <wp:docPr id="71568671" name="Grafik 1"/>
+            <wp:cNvGraphicFramePr>
+              <a:graphicFrameLocks xmlns:a="http://schemas.openxmlformats.org/drawingml/2006/main" noChangeAspect="1"/>
+            </wp:cNvGraphicFramePr>
+            <a:graphic xmlns:a="http://schemas.openxmlformats.org/drawingml/2006/main">
+              <a:graphicData uri="http://schemas.openxmlformats.org/drawingml/2006/picture">
+                <pic:pic xmlns:pic="http://schemas.openxmlformats.org/drawingml/2006/picture">
+                  <pic:nvPicPr>
+                    <pic:cNvPr id="71568671" name=""/>
+                    <pic:cNvPicPr/>
+                  </pic:nvPicPr>
+                  <pic:blipFill>
+                    <a:blip r:embed="rId26"/>
+                    <a:stretch>
+                      <a:fillRect/>
+                    </a:stretch>
+                  </pic:blipFill>
+                  <pic:spPr>
+                    <a:xfrm>
+                      <a:off x="0" y="0"/>
+                      <a:ext cx="3072910" cy="4838518"/>
+                    </a:xfrm>
+                    <a:prstGeom prst="rect">
+                      <a:avLst/>
+                    </a:prstGeom>
+                  </pic:spPr>
+                </pic:pic>
+              </a:graphicData>
+            </a:graphic>
+          </wp:inline>
+        </w:drawing>
+      </w:r>
     </w:p>
     <w:p>
       <w:pPr>
@@ -3113,79 +2586,6 @@
         <w:spacing w:after="160"/>
       </w:pPr>
     </w:p>
-    <w:tbl>
-      <w:tblPr>
-        <w:tblW w:w="10206" w:type="dxa"/>
-        <w:tblBorders>
-          <w:top w:val="dashed" w:sz="8" w:space="0" w:color="AAAAAA"/>
-          <w:left w:val="dashed" w:sz="8" w:space="0" w:color="AAAAAA"/>
-          <w:bottom w:val="dashed" w:sz="8" w:space="0" w:color="AAAAAA"/>
-          <w:right w:val="dashed" w:sz="8" w:space="0" w:color="AAAAAA"/>
-          <w:insideH w:val="none" w:sz="0" w:space="0" w:color="FFFFFF"/>
-          <w:insideV w:val="none" w:sz="0" w:space="0" w:color="FFFFFF"/>
-        </w:tblBorders>
-        <w:tblCellMar>
-          <w:left w:w="10" w:type="dxa"/>
-          <w:right w:w="10" w:type="dxa"/>
-        </w:tblCellMar>
-        <w:tblLook w:val="04A0" w:firstRow="1" w:lastRow="0" w:firstColumn="1" w:lastColumn="0" w:noHBand="0" w:noVBand="1"/>
-      </w:tblPr>
-      <w:tblGrid>
-        <w:gridCol w:w="10206"/>
-      </w:tblGrid>
-      <w:tr>
-        <w:tblPrEx>
-          <w:tblCellMar>
-            <w:top w:w="0" w:type="dxa"/>
-            <w:bottom w:w="0" w:type="dxa"/>
-          </w:tblCellMar>
-        </w:tblPrEx>
-        <w:tc>
-          <w:tcPr>
-            <w:tcW w:w="10206" w:type="dxa"/>
-            <w:shd w:val="clear" w:color="auto" w:fill="F4F4F4"/>
-            <w:tcMar>
-              <w:top w:w="160" w:type="dxa"/>
-              <w:left w:w="220" w:type="dxa"/>
-              <w:bottom w:w="160" w:type="dxa"/>
-              <w:right w:w="220" w:type="dxa"/>
-            </w:tcMar>
-          </w:tcPr>
-          <w:p>
-            <w:pPr>
-              <w:spacing w:before="320" w:after="320"/>
-              <w:jc w:val="center"/>
-            </w:pPr>
-            <w:r>
-              <w:rPr>
-                <w:b/>
-                <w:bCs/>
-                <w:color w:val="666666"/>
-                <w:sz w:val="26"/>
-                <w:szCs w:val="26"/>
-              </w:rPr>
-              <w:t>🖼️  Platz für Screenshot</w:t>
-            </w:r>
-          </w:p>
-          <w:p>
-            <w:pPr>
-              <w:spacing w:after="320"/>
-              <w:jc w:val="center"/>
-            </w:pPr>
-            <w:r>
-              <w:rPr>
-                <w:i/>
-                <w:iCs/>
-                <w:color w:val="888888"/>
-                <w:sz w:val="22"/>
-                <w:szCs w:val="22"/>
-              </w:rPr>
-              <w:t>fertiges Fisch-Skript mit allen drei falls-Blöcken</w:t>
-            </w:r>
-          </w:p>
-        </w:tc>
-      </w:tr>
-    </w:tbl>
     <w:p>
       <w:pPr>
         <w:pageBreakBefore/>
@@ -3247,7 +2647,7 @@
                     </pic:cNvPicPr>
                   </pic:nvPicPr>
                   <pic:blipFill>
-                    <a:blip r:embed="rId18"/>
+                    <a:blip r:embed="rId27"/>
                     <a:srcRect/>
                     <a:stretch>
                       <a:fillRect/>
@@ -3318,7 +2718,25 @@
           <w:sz w:val="26"/>
           <w:szCs w:val="26"/>
         </w:rPr>
-        <w:t>Den Block „wenn grüne Fahne 🟢 angeklickt wird“ (🟡 Ereignisse).</w:t>
+        <w:t xml:space="preserve">Den Block </w:t>
+      </w:r>
+      <w:proofErr w:type="gramStart"/>
+      <w:r>
+        <w:rPr>
+          <w:color w:val="1A1A1A"/>
+          <w:sz w:val="26"/>
+          <w:szCs w:val="26"/>
+        </w:rPr>
+        <w:t>„</w:t>
+      </w:r>
+      <w:proofErr w:type="gramEnd"/>
+      <w:r>
+        <w:rPr>
+          <w:color w:val="1A1A1A"/>
+          <w:sz w:val="26"/>
+          <w:szCs w:val="26"/>
+        </w:rPr>
+        <w:t>wenn grüne Fahne angeklickt wird“ (Ereignisse).</w:t>
       </w:r>
     </w:p>
     <w:p>
@@ -3342,7 +2760,7 @@
           <w:sz w:val="26"/>
           <w:szCs w:val="26"/>
         </w:rPr>
-        <w:t>Darunter den Block „wiederhole fortlaufend“ (🟠 Steuerung).</w:t>
+        <w:t>Darunter den Block „wiederhole fortlaufend“ (Steuerung).</w:t>
       </w:r>
     </w:p>
     <w:p>
@@ -3366,7 +2784,25 @@
           <w:sz w:val="26"/>
           <w:szCs w:val="26"/>
         </w:rPr>
-        <w:t>Darin die Blöcke „gehe ( ) Schritte“ und „pralle vom Rand ab“ (beide 🔵 Bewegung).</w:t>
+        <w:t xml:space="preserve">Darin die Blöcke „gehe </w:t>
+      </w:r>
+      <w:proofErr w:type="gramStart"/>
+      <w:r>
+        <w:rPr>
+          <w:color w:val="1A1A1A"/>
+          <w:sz w:val="26"/>
+          <w:szCs w:val="26"/>
+        </w:rPr>
+        <w:t>( )</w:t>
+      </w:r>
+      <w:proofErr w:type="gramEnd"/>
+      <w:r>
+        <w:rPr>
+          <w:color w:val="1A1A1A"/>
+          <w:sz w:val="26"/>
+          <w:szCs w:val="26"/>
+        </w:rPr>
+        <w:t xml:space="preserve"> Schritte“ und „pralle vom Rand ab“ (beide Bewegung).</w:t>
       </w:r>
     </w:p>
     <w:tbl>
@@ -3390,12 +2826,6 @@
         <w:gridCol w:w="10206"/>
       </w:tblGrid>
       <w:tr>
-        <w:tblPrEx>
-          <w:tblCellMar>
-            <w:top w:w="0" w:type="dxa"/>
-            <w:bottom w:w="0" w:type="dxa"/>
-          </w:tblCellMar>
-        </w:tblPrEx>
         <w:tc>
           <w:tcPr>
             <w:tcW w:w="10206" w:type="dxa"/>
@@ -3424,7 +2854,25 @@
                 <w:sz w:val="26"/>
                 <w:szCs w:val="26"/>
               </w:rPr>
-              <w:t>Damit die Ente hoch und runter patrouilliert statt links-rechts wie die Angel, ergänze vor der Dauerschleife noch den Block „setze Richtung auf ( ) Grad“ (🔵 Bewegung) mit dem Wert 0 — dann wird's abwechslungsreicher.</w:t>
+              <w:t xml:space="preserve">Damit die Ente hoch und runter patrouilliert statt links-rechts wie die Angel, ergänze vor der Dauerschleife noch den Block „setze Richtung auf </w:t>
+            </w:r>
+            <w:proofErr w:type="gramStart"/>
+            <w:r>
+              <w:rPr>
+                <w:color w:val="1A1A1A"/>
+                <w:sz w:val="26"/>
+                <w:szCs w:val="26"/>
+              </w:rPr>
+              <w:t>( )</w:t>
+            </w:r>
+            <w:proofErr w:type="gramEnd"/>
+            <w:r>
+              <w:rPr>
+                <w:color w:val="1A1A1A"/>
+                <w:sz w:val="26"/>
+                <w:szCs w:val="26"/>
+              </w:rPr>
+              <w:t xml:space="preserve"> Grad“ (Bewegung) mit dem Wert 0 — dann wird's abwechslungsreicher.</w:t>
             </w:r>
           </w:p>
         </w:tc>
@@ -3463,79 +2911,6 @@
         <w:spacing w:after="160"/>
       </w:pPr>
     </w:p>
-    <w:tbl>
-      <w:tblPr>
-        <w:tblW w:w="10206" w:type="dxa"/>
-        <w:tblBorders>
-          <w:top w:val="dashed" w:sz="8" w:space="0" w:color="AAAAAA"/>
-          <w:left w:val="dashed" w:sz="8" w:space="0" w:color="AAAAAA"/>
-          <w:bottom w:val="dashed" w:sz="8" w:space="0" w:color="AAAAAA"/>
-          <w:right w:val="dashed" w:sz="8" w:space="0" w:color="AAAAAA"/>
-          <w:insideH w:val="none" w:sz="0" w:space="0" w:color="FFFFFF"/>
-          <w:insideV w:val="none" w:sz="0" w:space="0" w:color="FFFFFF"/>
-        </w:tblBorders>
-        <w:tblCellMar>
-          <w:left w:w="10" w:type="dxa"/>
-          <w:right w:w="10" w:type="dxa"/>
-        </w:tblCellMar>
-        <w:tblLook w:val="04A0" w:firstRow="1" w:lastRow="0" w:firstColumn="1" w:lastColumn="0" w:noHBand="0" w:noVBand="1"/>
-      </w:tblPr>
-      <w:tblGrid>
-        <w:gridCol w:w="10206"/>
-      </w:tblGrid>
-      <w:tr>
-        <w:tblPrEx>
-          <w:tblCellMar>
-            <w:top w:w="0" w:type="dxa"/>
-            <w:bottom w:w="0" w:type="dxa"/>
-          </w:tblCellMar>
-        </w:tblPrEx>
-        <w:tc>
-          <w:tcPr>
-            <w:tcW w:w="10206" w:type="dxa"/>
-            <w:shd w:val="clear" w:color="auto" w:fill="F4F4F4"/>
-            <w:tcMar>
-              <w:top w:w="160" w:type="dxa"/>
-              <w:left w:w="220" w:type="dxa"/>
-              <w:bottom w:w="160" w:type="dxa"/>
-              <w:right w:w="220" w:type="dxa"/>
-            </w:tcMar>
-          </w:tcPr>
-          <w:p>
-            <w:pPr>
-              <w:spacing w:before="320" w:after="320"/>
-              <w:jc w:val="center"/>
-            </w:pPr>
-            <w:r>
-              <w:rPr>
-                <w:b/>
-                <w:bCs/>
-                <w:color w:val="666666"/>
-                <w:sz w:val="26"/>
-                <w:szCs w:val="26"/>
-              </w:rPr>
-              <w:t>🖼️  Platz für Screenshot</w:t>
-            </w:r>
-          </w:p>
-          <w:p>
-            <w:pPr>
-              <w:spacing w:after="320"/>
-              <w:jc w:val="center"/>
-            </w:pPr>
-            <w:r>
-              <w:rPr>
-                <w:i/>
-                <w:iCs/>
-                <w:color w:val="888888"/>
-                <w:sz w:val="22"/>
-                <w:szCs w:val="22"/>
-              </w:rPr>
-              <w:t>Ente-Figur mit eigenem Bewegungsskript</w:t>
-            </w:r>
-          </w:p>
-        </w:tc>
-      </w:tr>
-    </w:tbl>
     <w:p>
       <w:pPr>
         <w:pageBreakBefore/>
@@ -3570,181 +2945,48 @@
         <w:t>Skript auf der Ente-Figur:</w:t>
       </w:r>
     </w:p>
-    <w:tbl>
-      <w:tblPr>
-        <w:tblW w:w="10206" w:type="dxa"/>
-        <w:tblBorders>
-          <w:top w:val="single" w:sz="8" w:space="0" w:color="333333"/>
-          <w:left w:val="single" w:sz="8" w:space="0" w:color="333333"/>
-          <w:bottom w:val="single" w:sz="8" w:space="0" w:color="333333"/>
-          <w:right w:val="single" w:sz="8" w:space="0" w:color="333333"/>
-          <w:insideH w:val="single" w:sz="2" w:space="0" w:color="FFFFFF"/>
-          <w:insideV w:val="none" w:sz="0" w:space="0" w:color="FFFFFF"/>
-        </w:tblBorders>
-        <w:tblCellMar>
-          <w:left w:w="10" w:type="dxa"/>
-          <w:right w:w="10" w:type="dxa"/>
-        </w:tblCellMar>
-        <w:tblLook w:val="04A0" w:firstRow="1" w:lastRow="0" w:firstColumn="1" w:lastColumn="0" w:noHBand="0" w:noVBand="1"/>
-      </w:tblPr>
-      <w:tblGrid>
-        <w:gridCol w:w="10206"/>
-      </w:tblGrid>
-      <w:tr>
-        <w:tblPrEx>
-          <w:tblCellMar>
-            <w:top w:w="0" w:type="dxa"/>
-            <w:bottom w:w="0" w:type="dxa"/>
-          </w:tblCellMar>
-        </w:tblPrEx>
-        <w:tc>
-          <w:tcPr>
-            <w:tcW w:w="10206" w:type="dxa"/>
-            <w:shd w:val="clear" w:color="auto" w:fill="FFBF00"/>
-            <w:tcMar>
-              <w:top w:w="110" w:type="dxa"/>
-              <w:left w:w="260" w:type="dxa"/>
-              <w:bottom w:w="110" w:type="dxa"/>
-              <w:right w:w="200" w:type="dxa"/>
-            </w:tcMar>
-          </w:tcPr>
-          <w:p>
-            <w:r>
-              <w:rPr>
-                <w:b/>
-                <w:bCs/>
-                <w:color w:val="1A1A1A"/>
-              </w:rPr>
-              <w:t>wenn grüne Fahne 🟢 angeklickt wird</w:t>
-            </w:r>
-          </w:p>
-        </w:tc>
-      </w:tr>
-      <w:tr>
-        <w:tblPrEx>
-          <w:tblCellMar>
-            <w:top w:w="0" w:type="dxa"/>
-            <w:bottom w:w="0" w:type="dxa"/>
-          </w:tblCellMar>
-        </w:tblPrEx>
-        <w:tc>
-          <w:tcPr>
-            <w:tcW w:w="10206" w:type="dxa"/>
-            <w:shd w:val="clear" w:color="auto" w:fill="4C97FF"/>
-            <w:tcMar>
-              <w:top w:w="110" w:type="dxa"/>
-              <w:left w:w="260" w:type="dxa"/>
-              <w:bottom w:w="110" w:type="dxa"/>
-              <w:right w:w="200" w:type="dxa"/>
-            </w:tcMar>
-          </w:tcPr>
-          <w:p>
-            <w:r>
-              <w:rPr>
-                <w:b/>
-                <w:bCs/>
-                <w:color w:val="1A1A1A"/>
-              </w:rPr>
-              <w:t>setze Richtung auf (0) Grad</w:t>
-            </w:r>
-          </w:p>
-        </w:tc>
-      </w:tr>
-      <w:tr>
-        <w:tblPrEx>
-          <w:tblCellMar>
-            <w:top w:w="0" w:type="dxa"/>
-            <w:bottom w:w="0" w:type="dxa"/>
-          </w:tblCellMar>
-        </w:tblPrEx>
-        <w:tc>
-          <w:tcPr>
-            <w:tcW w:w="10206" w:type="dxa"/>
-            <w:shd w:val="clear" w:color="auto" w:fill="FFAB19"/>
-            <w:tcMar>
-              <w:top w:w="110" w:type="dxa"/>
-              <w:left w:w="260" w:type="dxa"/>
-              <w:bottom w:w="110" w:type="dxa"/>
-              <w:right w:w="200" w:type="dxa"/>
-            </w:tcMar>
-          </w:tcPr>
-          <w:p>
-            <w:r>
-              <w:rPr>
-                <w:b/>
-                <w:bCs/>
-                <w:color w:val="1A1A1A"/>
-              </w:rPr>
-              <w:t>wiederhole fortlaufend</w:t>
-            </w:r>
-          </w:p>
-        </w:tc>
-      </w:tr>
-      <w:tr>
-        <w:tblPrEx>
-          <w:tblCellMar>
-            <w:top w:w="0" w:type="dxa"/>
-            <w:bottom w:w="0" w:type="dxa"/>
-          </w:tblCellMar>
-        </w:tblPrEx>
-        <w:tc>
-          <w:tcPr>
-            <w:tcW w:w="10206" w:type="dxa"/>
-            <w:shd w:val="clear" w:color="auto" w:fill="4C97FF"/>
-            <w:tcMar>
-              <w:top w:w="110" w:type="dxa"/>
-              <w:left w:w="780" w:type="dxa"/>
-              <w:bottom w:w="110" w:type="dxa"/>
-              <w:right w:w="200" w:type="dxa"/>
-            </w:tcMar>
-          </w:tcPr>
-          <w:p>
-            <w:r>
-              <w:rPr>
-                <w:b/>
-                <w:bCs/>
-                <w:color w:val="1A1A1A"/>
-              </w:rPr>
-              <w:t>gehe (4) Schritte</w:t>
-            </w:r>
-          </w:p>
-        </w:tc>
-      </w:tr>
-      <w:tr>
-        <w:tblPrEx>
-          <w:tblCellMar>
-            <w:top w:w="0" w:type="dxa"/>
-            <w:bottom w:w="0" w:type="dxa"/>
-          </w:tblCellMar>
-        </w:tblPrEx>
-        <w:tc>
-          <w:tcPr>
-            <w:tcW w:w="10206" w:type="dxa"/>
-            <w:shd w:val="clear" w:color="auto" w:fill="4C97FF"/>
-            <w:tcMar>
-              <w:top w:w="110" w:type="dxa"/>
-              <w:left w:w="780" w:type="dxa"/>
-              <w:bottom w:w="110" w:type="dxa"/>
-              <w:right w:w="200" w:type="dxa"/>
-            </w:tcMar>
-          </w:tcPr>
-          <w:p>
-            <w:r>
-              <w:rPr>
-                <w:b/>
-                <w:bCs/>
-                <w:color w:val="1A1A1A"/>
-              </w:rPr>
-              <w:t>pralle vom Rand ab</w:t>
-            </w:r>
-          </w:p>
-        </w:tc>
-      </w:tr>
-    </w:tbl>
     <w:p>
       <w:pPr>
         <w:spacing w:after="160"/>
-      </w:pPr>
+        <w:jc w:val="center"/>
+      </w:pPr>
+      <w:r>
+        <w:drawing>
+          <wp:inline distT="0" distB="0" distL="0" distR="0" wp14:anchorId="6A2AF993" wp14:editId="0DB570B2">
+            <wp:extent cx="2152950" cy="2562583"/>
+            <wp:effectExtent l="0" t="0" r="0" b="9525"/>
+            <wp:docPr id="1002415677" name="Grafik 1"/>
+            <wp:cNvGraphicFramePr>
+              <a:graphicFrameLocks xmlns:a="http://schemas.openxmlformats.org/drawingml/2006/main" noChangeAspect="1"/>
+            </wp:cNvGraphicFramePr>
+            <a:graphic xmlns:a="http://schemas.openxmlformats.org/drawingml/2006/main">
+              <a:graphicData uri="http://schemas.openxmlformats.org/drawingml/2006/picture">
+                <pic:pic xmlns:pic="http://schemas.openxmlformats.org/drawingml/2006/picture">
+                  <pic:nvPicPr>
+                    <pic:cNvPr id="1002415677" name=""/>
+                    <pic:cNvPicPr/>
+                  </pic:nvPicPr>
+                  <pic:blipFill>
+                    <a:blip r:embed="rId28"/>
+                    <a:stretch>
+                      <a:fillRect/>
+                    </a:stretch>
+                  </pic:blipFill>
+                  <pic:spPr>
+                    <a:xfrm>
+                      <a:off x="0" y="0"/>
+                      <a:ext cx="2152950" cy="2562583"/>
+                    </a:xfrm>
+                    <a:prstGeom prst="rect">
+                      <a:avLst/>
+                    </a:prstGeom>
+                  </pic:spPr>
+                </pic:pic>
+              </a:graphicData>
+            </a:graphic>
+          </wp:inline>
+        </w:drawing>
+      </w:r>
     </w:p>
     <w:p>
       <w:pPr>
@@ -3759,91 +3001,48 @@
         <w:t>Vierter falls...dann auf der Fisch-Figur, wieder in derselben Dauerschleife:</w:t>
       </w:r>
     </w:p>
-    <w:tbl>
-      <w:tblPr>
-        <w:tblW w:w="10206" w:type="dxa"/>
-        <w:tblBorders>
-          <w:top w:val="single" w:sz="8" w:space="0" w:color="333333"/>
-          <w:left w:val="single" w:sz="8" w:space="0" w:color="333333"/>
-          <w:bottom w:val="single" w:sz="8" w:space="0" w:color="333333"/>
-          <w:right w:val="single" w:sz="8" w:space="0" w:color="333333"/>
-          <w:insideH w:val="single" w:sz="2" w:space="0" w:color="FFFFFF"/>
-          <w:insideV w:val="none" w:sz="0" w:space="0" w:color="FFFFFF"/>
-        </w:tblBorders>
-        <w:tblCellMar>
-          <w:left w:w="10" w:type="dxa"/>
-          <w:right w:w="10" w:type="dxa"/>
-        </w:tblCellMar>
-        <w:tblLook w:val="04A0" w:firstRow="1" w:lastRow="0" w:firstColumn="1" w:lastColumn="0" w:noHBand="0" w:noVBand="1"/>
-      </w:tblPr>
-      <w:tblGrid>
-        <w:gridCol w:w="10206"/>
-      </w:tblGrid>
-      <w:tr>
-        <w:tblPrEx>
-          <w:tblCellMar>
-            <w:top w:w="0" w:type="dxa"/>
-            <w:bottom w:w="0" w:type="dxa"/>
-          </w:tblCellMar>
-        </w:tblPrEx>
-        <w:tc>
-          <w:tcPr>
-            <w:tcW w:w="10206" w:type="dxa"/>
-            <w:shd w:val="clear" w:color="auto" w:fill="FFAB19"/>
-            <w:tcMar>
-              <w:top w:w="110" w:type="dxa"/>
-              <w:left w:w="780" w:type="dxa"/>
-              <w:bottom w:w="110" w:type="dxa"/>
-              <w:right w:w="200" w:type="dxa"/>
-            </w:tcMar>
-          </w:tcPr>
-          <w:p>
-            <w:r>
-              <w:rPr>
-                <w:b/>
-                <w:bCs/>
-                <w:color w:val="1A1A1A"/>
-              </w:rPr>
-              <w:t>falls &lt; 🔷 wird [Ente] berührt? &gt;, dann</w:t>
-            </w:r>
-          </w:p>
-        </w:tc>
-      </w:tr>
-      <w:tr>
-        <w:tblPrEx>
-          <w:tblCellMar>
-            <w:top w:w="0" w:type="dxa"/>
-            <w:bottom w:w="0" w:type="dxa"/>
-          </w:tblCellMar>
-        </w:tblPrEx>
-        <w:tc>
-          <w:tcPr>
-            <w:tcW w:w="10206" w:type="dxa"/>
-            <w:shd w:val="clear" w:color="auto" w:fill="4C97FF"/>
-            <w:tcMar>
-              <w:top w:w="110" w:type="dxa"/>
-              <w:left w:w="1300" w:type="dxa"/>
-              <w:bottom w:w="110" w:type="dxa"/>
-              <w:right w:w="200" w:type="dxa"/>
-            </w:tcMar>
-          </w:tcPr>
-          <w:p>
-            <w:r>
-              <w:rPr>
-                <w:b/>
-                <w:bCs/>
-                <w:color w:val="1A1A1A"/>
-              </w:rPr>
-              <w:t>gehe zu x: (⚙️ Start-x) y: (⚙️ Start-y)</w:t>
-            </w:r>
-          </w:p>
-        </w:tc>
-      </w:tr>
-    </w:tbl>
     <w:p>
       <w:pPr>
         <w:spacing w:after="160"/>
-      </w:pPr>
+        <w:jc w:val="center"/>
+      </w:pPr>
+      <w:r>
+        <w:drawing>
+          <wp:inline distT="0" distB="0" distL="0" distR="0" wp14:anchorId="2E1D34C5" wp14:editId="7DA2C8B8">
+            <wp:extent cx="2369174" cy="4579620"/>
+            <wp:effectExtent l="0" t="0" r="0" b="0"/>
+            <wp:docPr id="1411248929" name="Grafik 1"/>
+            <wp:cNvGraphicFramePr>
+              <a:graphicFrameLocks xmlns:a="http://schemas.openxmlformats.org/drawingml/2006/main" noChangeAspect="1"/>
+            </wp:cNvGraphicFramePr>
+            <a:graphic xmlns:a="http://schemas.openxmlformats.org/drawingml/2006/main">
+              <a:graphicData uri="http://schemas.openxmlformats.org/drawingml/2006/picture">
+                <pic:pic xmlns:pic="http://schemas.openxmlformats.org/drawingml/2006/picture">
+                  <pic:nvPicPr>
+                    <pic:cNvPr id="1411248929" name=""/>
+                    <pic:cNvPicPr/>
+                  </pic:nvPicPr>
+                  <pic:blipFill>
+                    <a:blip r:embed="rId29"/>
+                    <a:stretch>
+                      <a:fillRect/>
+                    </a:stretch>
+                  </pic:blipFill>
+                  <pic:spPr>
+                    <a:xfrm>
+                      <a:off x="0" y="0"/>
+                      <a:ext cx="2376247" cy="4593292"/>
+                    </a:xfrm>
+                    <a:prstGeom prst="rect">
+                      <a:avLst/>
+                    </a:prstGeom>
+                  </pic:spPr>
+                </pic:pic>
+              </a:graphicData>
+            </a:graphic>
+          </wp:inline>
+        </w:drawing>
+      </w:r>
     </w:p>
     <w:p>
       <w:pPr>
@@ -3868,85 +3067,6 @@
         <w:t>Jetzt hat dein Fisch zwei Gegner gleichzeitig im Weg, Angel und Ente. Falls das zu leicht ist: Erhöh einfach die Zahl bei „gehe ( ) Schritte“, dann patrouillieren beide schneller.</w:t>
       </w:r>
     </w:p>
-    <w:p>
-      <w:pPr>
-        <w:spacing w:after="160"/>
-      </w:pPr>
-    </w:p>
-    <w:tbl>
-      <w:tblPr>
-        <w:tblW w:w="10206" w:type="dxa"/>
-        <w:tblBorders>
-          <w:top w:val="dashed" w:sz="8" w:space="0" w:color="AAAAAA"/>
-          <w:left w:val="dashed" w:sz="8" w:space="0" w:color="AAAAAA"/>
-          <w:bottom w:val="dashed" w:sz="8" w:space="0" w:color="AAAAAA"/>
-          <w:right w:val="dashed" w:sz="8" w:space="0" w:color="AAAAAA"/>
-          <w:insideH w:val="none" w:sz="0" w:space="0" w:color="FFFFFF"/>
-          <w:insideV w:val="none" w:sz="0" w:space="0" w:color="FFFFFF"/>
-        </w:tblBorders>
-        <w:tblCellMar>
-          <w:left w:w="10" w:type="dxa"/>
-          <w:right w:w="10" w:type="dxa"/>
-        </w:tblCellMar>
-        <w:tblLook w:val="04A0" w:firstRow="1" w:lastRow="0" w:firstColumn="1" w:lastColumn="0" w:noHBand="0" w:noVBand="1"/>
-      </w:tblPr>
-      <w:tblGrid>
-        <w:gridCol w:w="10206"/>
-      </w:tblGrid>
-      <w:tr>
-        <w:tblPrEx>
-          <w:tblCellMar>
-            <w:top w:w="0" w:type="dxa"/>
-            <w:bottom w:w="0" w:type="dxa"/>
-          </w:tblCellMar>
-        </w:tblPrEx>
-        <w:tc>
-          <w:tcPr>
-            <w:tcW w:w="10206" w:type="dxa"/>
-            <w:shd w:val="clear" w:color="auto" w:fill="F4F4F4"/>
-            <w:tcMar>
-              <w:top w:w="160" w:type="dxa"/>
-              <w:left w:w="220" w:type="dxa"/>
-              <w:bottom w:w="160" w:type="dxa"/>
-              <w:right w:w="220" w:type="dxa"/>
-            </w:tcMar>
-          </w:tcPr>
-          <w:p>
-            <w:pPr>
-              <w:spacing w:before="320" w:after="320"/>
-              <w:jc w:val="center"/>
-            </w:pPr>
-            <w:r>
-              <w:rPr>
-                <w:b/>
-                <w:bCs/>
-                <w:color w:val="666666"/>
-                <w:sz w:val="26"/>
-                <w:szCs w:val="26"/>
-              </w:rPr>
-              <w:t>🖼️  Platz für Screenshot</w:t>
-            </w:r>
-          </w:p>
-          <w:p>
-            <w:pPr>
-              <w:spacing w:after="320"/>
-              <w:jc w:val="center"/>
-            </w:pPr>
-            <w:r>
-              <w:rPr>
-                <w:i/>
-                <w:iCs/>
-                <w:color w:val="888888"/>
-                <w:sz w:val="22"/>
-                <w:szCs w:val="22"/>
-              </w:rPr>
-              <w:t>fertiges Fisch-Skript mit allen vier falls-Blöcken</w:t>
-            </w:r>
-          </w:p>
-        </w:tc>
-      </w:tr>
-    </w:tbl>
-    <w:p/>
     <w:sectPr>
       <w:pgSz w:w="11906" w:h="16838"/>
       <w:pgMar w:top="850" w:right="850" w:bottom="850" w:left="850" w:header="708" w:footer="708" w:gutter="0"/>

</xml_diff>

<commit_message>
Refresh card instruction materials
Updated the card instruction handout in both DOCX and PDF formats. This keeps the workshop materials aligned with the latest version of the course guidance.
</commit_message>
<xml_diff>
--- a/kurs/anleitung-karten.docx
+++ b/kurs/anleitung-karten.docx
@@ -337,6 +337,9 @@
         <w:jc w:val="center"/>
       </w:pPr>
       <w:r>
+        <w:rPr>
+          <w:noProof/>
+        </w:rPr>
         <w:drawing>
           <wp:inline distT="0" distB="0" distL="0" distR="0" wp14:anchorId="2B30EE1E" wp14:editId="79B0792F">
             <wp:extent cx="5214232" cy="3939540"/>
@@ -1420,6 +1423,7 @@
       </w:r>
       <w:r>
         <w:rPr>
+          <w:noProof/>
           <w:color w:val="1A1A1A"/>
           <w:sz w:val="26"/>
           <w:szCs w:val="26"/>
@@ -1554,7 +1558,8 @@
     </w:p>
     <w:tbl>
       <w:tblPr>
-        <w:tblW w:w="10206" w:type="dxa"/>
+        <w:tblpPr w:leftFromText="141" w:rightFromText="141" w:vertAnchor="page" w:horzAnchor="margin" w:tblpXSpec="right" w:tblpY="12817"/>
+        <w:tblW w:w="4785" w:type="dxa"/>
         <w:tblBorders>
           <w:top w:val="single" w:sz="8" w:space="0" w:color="E8B923"/>
           <w:left w:val="single" w:sz="8" w:space="0" w:color="E8B923"/>
@@ -1570,12 +1575,15 @@
         <w:tblLook w:val="04A0" w:firstRow="1" w:lastRow="0" w:firstColumn="1" w:lastColumn="0" w:noHBand="0" w:noVBand="1"/>
       </w:tblPr>
       <w:tblGrid>
-        <w:gridCol w:w="10206"/>
+        <w:gridCol w:w="4785"/>
       </w:tblGrid>
       <w:tr>
+        <w:trPr>
+          <w:trHeight w:val="1459"/>
+        </w:trPr>
         <w:tc>
           <w:tcPr>
-            <w:tcW w:w="10206" w:type="dxa"/>
+            <w:tcW w:w="4785" w:type="dxa"/>
             <w:shd w:val="clear" w:color="auto" w:fill="FFF6D9"/>
             <w:tcMar>
               <w:top w:w="160" w:type="dxa"/>
@@ -1610,7 +1618,144 @@
     <w:p>
       <w:pPr>
         <w:spacing w:after="160"/>
-      </w:pPr>
+        <w:jc w:val="center"/>
+      </w:pPr>
+      <w:r>
+        <w:rPr>
+          <w:b/>
+          <w:bCs/>
+          <w:noProof/>
+          <w:color w:val="7A5B00"/>
+          <w:sz w:val="26"/>
+          <w:szCs w:val="26"/>
+        </w:rPr>
+        <mc:AlternateContent>
+          <mc:Choice Requires="wps">
+            <w:drawing>
+              <wp:anchor distT="45720" distB="45720" distL="114300" distR="114300" simplePos="0" relativeHeight="251659264" behindDoc="0" locked="0" layoutInCell="1" allowOverlap="1" wp14:anchorId="3C53FE25" wp14:editId="442F1068">
+                <wp:simplePos x="0" y="0"/>
+                <wp:positionH relativeFrom="column">
+                  <wp:posOffset>1761490</wp:posOffset>
+                </wp:positionH>
+                <wp:positionV relativeFrom="paragraph">
+                  <wp:posOffset>1564005</wp:posOffset>
+                </wp:positionV>
+                <wp:extent cx="899160" cy="457200"/>
+                <wp:effectExtent l="0" t="0" r="15240" b="19050"/>
+                <wp:wrapSquare wrapText="bothSides"/>
+                <wp:docPr id="217" name="Textfeld 2"/>
+                <wp:cNvGraphicFramePr>
+                  <a:graphicFrameLocks xmlns:a="http://schemas.openxmlformats.org/drawingml/2006/main"/>
+                </wp:cNvGraphicFramePr>
+                <a:graphic xmlns:a="http://schemas.openxmlformats.org/drawingml/2006/main">
+                  <a:graphicData uri="http://schemas.microsoft.com/office/word/2010/wordprocessingShape">
+                    <wps:wsp>
+                      <wps:cNvSpPr txBox="1">
+                        <a:spLocks noChangeArrowheads="1"/>
+                      </wps:cNvSpPr>
+                      <wps:spPr bwMode="auto">
+                        <a:xfrm>
+                          <a:off x="0" y="0"/>
+                          <a:ext cx="899160" cy="457200"/>
+                        </a:xfrm>
+                        <a:prstGeom prst="rect">
+                          <a:avLst/>
+                        </a:prstGeom>
+                        <a:solidFill>
+                          <a:srgbClr val="FFFFFF"/>
+                        </a:solidFill>
+                        <a:ln w="9525">
+                          <a:solidFill>
+                            <a:schemeClr val="bg1"/>
+                          </a:solidFill>
+                          <a:miter lim="800000"/>
+                          <a:headEnd/>
+                          <a:tailEnd/>
+                        </a:ln>
+                      </wps:spPr>
+                      <wps:txbx>
+                        <w:txbxContent>
+                          <w:p>
+                            <w:r>
+                              <w:t>Pipette</w:t>
+                            </w:r>
+                          </w:p>
+                        </w:txbxContent>
+                      </wps:txbx>
+                      <wps:bodyPr rot="0" vert="horz" wrap="square" lIns="91440" tIns="45720" rIns="91440" bIns="45720" anchor="t" anchorCtr="0">
+                        <a:noAutofit/>
+                      </wps:bodyPr>
+                    </wps:wsp>
+                  </a:graphicData>
+                </a:graphic>
+                <wp14:sizeRelH relativeFrom="margin">
+                  <wp14:pctWidth>0</wp14:pctWidth>
+                </wp14:sizeRelH>
+                <wp14:sizeRelV relativeFrom="margin">
+                  <wp14:pctHeight>0</wp14:pctHeight>
+                </wp14:sizeRelV>
+              </wp:anchor>
+            </w:drawing>
+          </mc:Choice>
+          <mc:Fallback>
+            <w:pict>
+              <v:shapetype w14:anchorId="3C53FE25" id="_x0000_t202" coordsize="21600,21600" o:spt="202" path="m,l,21600r21600,l21600,xe">
+                <v:stroke joinstyle="miter"/>
+                <v:path gradientshapeok="t" o:connecttype="rect"/>
+              </v:shapetype>
+              <v:shape id="Textfeld 2" o:spid="_x0000_s1026" type="#_x0000_t202" style="position:absolute;left:0;text-align:left;margin-left:138.7pt;margin-top:123.15pt;width:70.8pt;height:36pt;z-index:251659264;visibility:visible;mso-wrap-style:square;mso-width-percent:0;mso-height-percent:0;mso-wrap-distance-left:9pt;mso-wrap-distance-top:3.6pt;mso-wrap-distance-right:9pt;mso-wrap-distance-bottom:3.6pt;mso-position-horizontal:absolute;mso-position-horizontal-relative:text;mso-position-vertical:absolute;mso-position-vertical-relative:text;mso-width-percent:0;mso-height-percent:0;mso-width-relative:margin;mso-height-relative:margin;v-text-anchor:top" o:gfxdata="UEsDBBQABgAIAAAAIQC2gziS/gAAAOEBAAATAAAAW0NvbnRlbnRfVHlwZXNdLnhtbJSRQU7DMBBF&#10;90jcwfIWJU67QAgl6YK0S0CoHGBkTxKLZGx5TGhvj5O2G0SRWNoz/78nu9wcxkFMGNg6quQqL6RA&#10;0s5Y6ir5vt9lD1JwBDIwOMJKHpHlpr69KfdHjyxSmriSfYz+USnWPY7AufNIadK6MEJMx9ApD/oD&#10;OlTrorhX2lFEilmcO2RdNtjC5xDF9pCuTyYBB5bi6bQ4syoJ3g9WQ0ymaiLzg5KdCXlKLjvcW893&#10;SUOqXwnz5DrgnHtJTxOsQfEKIT7DmDSUCaxw7Rqn8787ZsmRM9e2VmPeBN4uqYvTtW7jvijg9N/y&#10;JsXecLq0q+WD6m8AAAD//wMAUEsDBBQABgAIAAAAIQA4/SH/1gAAAJQBAAALAAAAX3JlbHMvLnJl&#10;bHOkkMFqwzAMhu+DvYPRfXGawxijTi+j0GvpHsDYimMaW0Yy2fr2M4PBMnrbUb/Q94l/f/hMi1qR&#10;JVI2sOt6UJgd+ZiDgffL8ekFlFSbvV0oo4EbChzGx4f9GRdb25HMsYhqlCwG5lrLq9biZkxWOiqY&#10;22YiTra2kYMu1l1tQD30/bPm3wwYN0x18gb45AdQl1tp5j/sFB2T0FQ7R0nTNEV3j6o9feQzro1i&#10;OWA14Fm+Q8a1a8+Bvu/d/dMb2JY5uiPbhG/ktn4cqGU/er3pcvwCAAD//wMAUEsDBBQABgAIAAAA&#10;IQAE3wokEgIAAB0EAAAOAAAAZHJzL2Uyb0RvYy54bWysU8Fu2zAMvQ/YPwi6L06CpGuMOEWXLsOA&#10;rhvQ7QNkWY6FyaJGKbGzrx8lu2na3YbpIFAi9Ug+Pq1v+tawo0KvwRZ8NplypqyEStt9wX983727&#10;5swHYSthwKqCn5TnN5u3b9ady9UcGjCVQkYg1uedK3gTgsuzzMtGtcJPwClLzhqwFYGOuM8qFB2h&#10;tyabT6dXWQdYOQSpvKfbu8HJNwm/rpUMX+vaq8BMwam2kHZMexn3bLMW+R6Fa7QcyxD/UEUrtKWk&#10;Z6g7EQQ7oP4LqtUSwUMdJhLaDOpaS5V6oG5m01fdPDbCqdQLkePdmSb//2Dlw/HRfUMW+g/Q0wBT&#10;E97dg/zpmYVtI+xe3SJC1yhRUeJZpCzrnM/Hp5Fqn/sIUnZfoKIhi0OABNTX2EZWqE9G6DSA05l0&#10;1Qcm6fJ6tZpdkUeSa7F8T0NNGUT+9NihD58UtCwaBUeaaQIXx3sfYjEifwqJuTwYXe20MemA+3Jr&#10;kB0FzX+X1oj+IsxY1hV8tZwvh/5fQEQpqjNIuR8YeJWo1YF0bHRLDU3jGpQVSftoq6SyILQZbKrY&#10;2JHFSNxAYejLngIjmyVUJ+ITYdAr/S8yGsDfnHWk1YL7XweBijPz2dJMVrPFIoo7HRKHnOGlp7z0&#10;CCsJquCBs8HchvQhIl8Wbml2tU68Plcy1koaTHSP/yWK/PKcop5/9eYPAAAA//8DAFBLAwQUAAYA&#10;CAAAACEA0ySyP+EAAAALAQAADwAAAGRycy9kb3ducmV2LnhtbEyPwU6DQBCG7ya+w2ZMvNmFQmiL&#10;LI3R2JsxRVM9LuwIRHaWsNsWfXrHk95mMl/++f5iO9tBnHDyvSMF8SICgdQ401Or4PXl8WYNwgdN&#10;Rg+OUMEXetiWlxeFzo070x5PVWgFh5DPtYIuhDGX0jcdWu0XbkTi24ebrA68Tq00kz5zuB3kMooy&#10;aXVP/KHTI9532HxWR6vAN1F2eE6rw1std/i9Mebhffek1PXVfHcLIuAc/mD41Wd1KNmpdkcyXgwK&#10;lqtVyigPaZaAYCKNN9yuVpDE6wRkWcj/HcofAAAA//8DAFBLAQItABQABgAIAAAAIQC2gziS/gAA&#10;AOEBAAATAAAAAAAAAAAAAAAAAAAAAABbQ29udGVudF9UeXBlc10ueG1sUEsBAi0AFAAGAAgAAAAh&#10;ADj9If/WAAAAlAEAAAsAAAAAAAAAAAAAAAAALwEAAF9yZWxzLy5yZWxzUEsBAi0AFAAGAAgAAAAh&#10;AATfCiQSAgAAHQQAAA4AAAAAAAAAAAAAAAAALgIAAGRycy9lMm9Eb2MueG1sUEsBAi0AFAAGAAgA&#10;AAAhANMksj/hAAAACwEAAA8AAAAAAAAAAAAAAAAAbAQAAGRycy9kb3ducmV2LnhtbFBLBQYAAAAA&#10;BAAEAPMAAAB6BQAAAAA=&#10;" strokecolor="white [3212]">
+                <v:textbox>
+                  <w:txbxContent>
+                    <w:p>
+                      <w:r>
+                        <w:t>Pipette</w:t>
+                      </w:r>
+                    </w:p>
+                  </w:txbxContent>
+                </v:textbox>
+                <w10:wrap type="square"/>
+              </v:shape>
+            </w:pict>
+          </mc:Fallback>
+        </mc:AlternateContent>
+      </w:r>
+      <w:r>
+        <w:drawing>
+          <wp:inline distT="0" distB="0" distL="0" distR="0" wp14:anchorId="7CE524B1" wp14:editId="09C83DCC">
+            <wp:extent cx="1201727" cy="2131060"/>
+            <wp:effectExtent l="0" t="0" r="0" b="2540"/>
+            <wp:docPr id="1929096436" name="Grafik 1"/>
+            <wp:cNvGraphicFramePr>
+              <a:graphicFrameLocks xmlns:a="http://schemas.openxmlformats.org/drawingml/2006/main" noChangeAspect="1"/>
+            </wp:cNvGraphicFramePr>
+            <a:graphic xmlns:a="http://schemas.openxmlformats.org/drawingml/2006/main">
+              <a:graphicData uri="http://schemas.openxmlformats.org/drawingml/2006/picture">
+                <pic:pic xmlns:pic="http://schemas.openxmlformats.org/drawingml/2006/picture">
+                  <pic:nvPicPr>
+                    <pic:cNvPr id="1929096436" name=""/>
+                    <pic:cNvPicPr/>
+                  </pic:nvPicPr>
+                  <pic:blipFill>
+                    <a:blip r:embed="rId18"/>
+                    <a:stretch>
+                      <a:fillRect/>
+                    </a:stretch>
+                  </pic:blipFill>
+                  <pic:spPr>
+                    <a:xfrm>
+                      <a:off x="0" y="0"/>
+                      <a:ext cx="1216059" cy="2156475"/>
+                    </a:xfrm>
+                    <a:prstGeom prst="rect">
+                      <a:avLst/>
+                    </a:prstGeom>
+                  </pic:spPr>
+                </pic:pic>
+              </a:graphicData>
+            </a:graphic>
+          </wp:inline>
+        </w:drawing>
+      </w:r>
     </w:p>
     <w:p>
       <w:pPr>
@@ -1639,6 +1784,9 @@
         <w:jc w:val="center"/>
       </w:pPr>
       <w:r>
+        <w:rPr>
+          <w:noProof/>
+        </w:rPr>
         <w:drawing>
           <wp:inline distT="0" distB="0" distL="0" distR="0" wp14:anchorId="227C5D07" wp14:editId="180998AE">
             <wp:extent cx="3524742" cy="3200847"/>
@@ -1655,7 +1803,7 @@
                     <pic:cNvPicPr/>
                   </pic:nvPicPr>
                   <pic:blipFill>
-                    <a:blip r:embed="rId18"/>
+                    <a:blip r:embed="rId19"/>
                     <a:stretch>
                       <a:fillRect/>
                     </a:stretch>
@@ -1899,6 +2047,9 @@
         <w:spacing w:after="160"/>
       </w:pPr>
       <w:r>
+        <w:rPr>
+          <w:noProof/>
+        </w:rPr>
         <w:drawing>
           <wp:inline distT="0" distB="0" distL="0" distR="0" wp14:anchorId="5936C50F" wp14:editId="2532BA1A">
             <wp:extent cx="1667108" cy="1171739"/>
@@ -1915,7 +2066,7 @@
                     <pic:cNvPicPr/>
                   </pic:nvPicPr>
                   <pic:blipFill>
-                    <a:blip r:embed="rId19"/>
+                    <a:blip r:embed="rId20"/>
                     <a:stretch>
                       <a:fillRect/>
                     </a:stretch>
@@ -1941,6 +2092,9 @@
         <w:spacing w:after="160"/>
       </w:pPr>
       <w:r>
+        <w:rPr>
+          <w:noProof/>
+        </w:rPr>
         <w:drawing>
           <wp:inline distT="0" distB="0" distL="0" distR="0" wp14:anchorId="7DCEF31E" wp14:editId="0751BD7D">
             <wp:extent cx="2667372" cy="523948"/>
@@ -1957,7 +2111,7 @@
                     <pic:cNvPicPr/>
                   </pic:nvPicPr>
                   <pic:blipFill>
-                    <a:blip r:embed="rId20"/>
+                    <a:blip r:embed="rId21"/>
                     <a:stretch>
                       <a:fillRect/>
                     </a:stretch>
@@ -1983,6 +2137,9 @@
         <w:spacing w:after="160"/>
       </w:pPr>
       <w:r>
+        <w:rPr>
+          <w:noProof/>
+        </w:rPr>
         <w:drawing>
           <wp:inline distT="0" distB="0" distL="0" distR="0" wp14:anchorId="287B0409" wp14:editId="12569248">
             <wp:extent cx="3172268" cy="628738"/>
@@ -1999,7 +2156,7 @@
                     <pic:cNvPicPr/>
                   </pic:nvPicPr>
                   <pic:blipFill>
-                    <a:blip r:embed="rId21"/>
+                    <a:blip r:embed="rId22"/>
                     <a:stretch>
                       <a:fillRect/>
                     </a:stretch>
@@ -2025,6 +2182,9 @@
         <w:spacing w:after="160"/>
       </w:pPr>
       <w:r>
+        <w:rPr>
+          <w:noProof/>
+        </w:rPr>
         <w:drawing>
           <wp:inline distT="0" distB="0" distL="0" distR="0" wp14:anchorId="642A812F" wp14:editId="4DAAC19D">
             <wp:extent cx="1467055" cy="600159"/>
@@ -2041,7 +2201,7 @@
                     <pic:cNvPicPr/>
                   </pic:nvPicPr>
                   <pic:blipFill>
-                    <a:blip r:embed="rId22"/>
+                    <a:blip r:embed="rId23"/>
                     <a:stretch>
                       <a:fillRect/>
                     </a:stretch>
@@ -2102,6 +2262,9 @@
         <w:jc w:val="center"/>
       </w:pPr>
       <w:r>
+        <w:rPr>
+          <w:noProof/>
+        </w:rPr>
         <w:drawing>
           <wp:inline distT="0" distB="0" distL="0" distR="0" wp14:anchorId="22C65110" wp14:editId="2D20A396">
             <wp:extent cx="3972479" cy="4991797"/>
@@ -2118,7 +2281,7 @@
                     <pic:cNvPicPr/>
                   </pic:nvPicPr>
                   <pic:blipFill>
-                    <a:blip r:embed="rId23"/>
+                    <a:blip r:embed="rId24"/>
                     <a:stretch>
                       <a:fillRect/>
                     </a:stretch>
@@ -2218,7 +2381,7 @@
                     </pic:cNvPicPr>
                   </pic:nvPicPr>
                   <pic:blipFill>
-                    <a:blip r:embed="rId24"/>
+                    <a:blip r:embed="rId25"/>
                     <a:srcRect/>
                     <a:stretch>
                       <a:fillRect/>
@@ -2465,6 +2628,9 @@
         <w:jc w:val="center"/>
       </w:pPr>
       <w:r>
+        <w:rPr>
+          <w:noProof/>
+        </w:rPr>
         <w:drawing>
           <wp:inline distT="0" distB="0" distL="0" distR="0" wp14:anchorId="6B4A4D13" wp14:editId="1C7BBD21">
             <wp:extent cx="2105319" cy="2467319"/>
@@ -2481,7 +2647,7 @@
                     <pic:cNvPicPr/>
                   </pic:nvPicPr>
                   <pic:blipFill>
-                    <a:blip r:embed="rId25"/>
+                    <a:blip r:embed="rId26"/>
                     <a:stretch>
                       <a:fillRect/>
                     </a:stretch>
@@ -2521,6 +2687,9 @@
         <w:jc w:val="center"/>
       </w:pPr>
       <w:r>
+        <w:rPr>
+          <w:noProof/>
+        </w:rPr>
         <w:drawing>
           <wp:inline distT="0" distB="0" distL="0" distR="0" wp14:anchorId="309A3DFA" wp14:editId="55C0716C">
             <wp:extent cx="3068186" cy="4831080"/>
@@ -2537,7 +2706,7 @@
                     <pic:cNvPicPr/>
                   </pic:nvPicPr>
                   <pic:blipFill>
-                    <a:blip r:embed="rId26"/>
+                    <a:blip r:embed="rId27"/>
                     <a:stretch>
                       <a:fillRect/>
                     </a:stretch>
@@ -2647,7 +2816,7 @@
                     </pic:cNvPicPr>
                   </pic:nvPicPr>
                   <pic:blipFill>
-                    <a:blip r:embed="rId27"/>
+                    <a:blip r:embed="rId28"/>
                     <a:srcRect/>
                     <a:stretch>
                       <a:fillRect/>
@@ -2951,6 +3120,9 @@
         <w:jc w:val="center"/>
       </w:pPr>
       <w:r>
+        <w:rPr>
+          <w:noProof/>
+        </w:rPr>
         <w:drawing>
           <wp:inline distT="0" distB="0" distL="0" distR="0" wp14:anchorId="6A2AF993" wp14:editId="0DB570B2">
             <wp:extent cx="2152950" cy="2562583"/>
@@ -2967,7 +3139,7 @@
                     <pic:cNvPicPr/>
                   </pic:nvPicPr>
                   <pic:blipFill>
-                    <a:blip r:embed="rId28"/>
+                    <a:blip r:embed="rId29"/>
                     <a:stretch>
                       <a:fillRect/>
                     </a:stretch>
@@ -3007,6 +3179,9 @@
         <w:jc w:val="center"/>
       </w:pPr>
       <w:r>
+        <w:rPr>
+          <w:noProof/>
+        </w:rPr>
         <w:drawing>
           <wp:inline distT="0" distB="0" distL="0" distR="0" wp14:anchorId="2E1D34C5" wp14:editId="7DA2C8B8">
             <wp:extent cx="2369174" cy="4579620"/>
@@ -3023,7 +3198,7 @@
                     <pic:cNvPicPr/>
                   </pic:nvPicPr>
                   <pic:blipFill>
-                    <a:blip r:embed="rId29"/>
+                    <a:blip r:embed="rId30"/>
                     <a:stretch>
                       <a:fillRect/>
                     </a:stretch>

</xml_diff>